<commit_message>
Renamed react folders, updated file contents
</commit_message>
<xml_diff>
--- a/react-topics.docx
+++ b/react-topics.docx
@@ -1798,8 +1798,17 @@
           <w:sz w:val="24"/>
           <w:szCs w:val="24"/>
         </w:rPr>
-        <w:t xml:space="preserve"> – get/post method using axios</w:t>
-      </w:r>
+        <w:t xml:space="preserve"> – get/post method using </w:t>
+      </w:r>
+      <w:proofErr w:type="spellStart"/>
+      <w:r>
+        <w:rPr>
+          <w:sz w:val="24"/>
+          <w:szCs w:val="24"/>
+        </w:rPr>
+        <w:t>axios</w:t>
+      </w:r>
+      <w:proofErr w:type="spellEnd"/>
     </w:p>
     <w:p>
       <w:pPr>
@@ -1867,6 +1876,7 @@
         </w:rPr>
         <w:t xml:space="preserve">What is </w:t>
       </w:r>
+      <w:proofErr w:type="spellStart"/>
       <w:r>
         <w:rPr>
           <w:sz w:val="24"/>
@@ -1881,6 +1891,7 @@
         </w:rPr>
         <w:t>createRoot</w:t>
       </w:r>
+      <w:proofErr w:type="spellEnd"/>
       <w:r>
         <w:rPr>
           <w:sz w:val="24"/>
@@ -1939,987 +1950,153 @@
           <w:sz w:val="24"/>
           <w:szCs w:val="24"/>
         </w:rPr>
-        <w:t>Hooks Concept</w:t>
-      </w:r>
-      <w:r>
-        <w:rPr>
+        <w:t>REDUX TOOLKIT CONCEPTS</w:t>
+      </w:r>
+    </w:p>
+    <w:p>
+      <w:pPr>
+        <w:pStyle w:val="ListParagraph"/>
+        <w:numPr>
+          <w:ilvl w:val="0"/>
+          <w:numId w:val="9"/>
+        </w:numPr>
+        <w:rPr>
+          <w:sz w:val="24"/>
+          <w:szCs w:val="24"/>
+        </w:rPr>
+      </w:pPr>
+      <w:r>
+        <w:rPr>
+          <w:sz w:val="24"/>
+          <w:szCs w:val="24"/>
+        </w:rPr>
+        <w:t>Shortcomings of core redux</w:t>
+      </w:r>
+    </w:p>
+    <w:p>
+      <w:pPr>
+        <w:pStyle w:val="ListParagraph"/>
+        <w:numPr>
+          <w:ilvl w:val="0"/>
+          <w:numId w:val="9"/>
+        </w:numPr>
+        <w:rPr>
+          <w:sz w:val="24"/>
+          <w:szCs w:val="24"/>
+        </w:rPr>
+      </w:pPr>
+      <w:r>
+        <w:rPr>
+          <w:sz w:val="24"/>
+          <w:szCs w:val="24"/>
+        </w:rPr>
+        <w:t>What is redux toolkit? Why do we need it?</w:t>
+      </w:r>
+    </w:p>
+    <w:p>
+      <w:pPr>
+        <w:pStyle w:val="ListParagraph"/>
+        <w:numPr>
+          <w:ilvl w:val="0"/>
+          <w:numId w:val="9"/>
+        </w:numPr>
+        <w:rPr>
+          <w:sz w:val="24"/>
+          <w:szCs w:val="24"/>
+        </w:rPr>
+      </w:pPr>
+      <w:r>
+        <w:rPr>
+          <w:sz w:val="24"/>
+          <w:szCs w:val="24"/>
+        </w:rPr>
+        <w:t>Async actions</w:t>
+      </w:r>
+    </w:p>
+    <w:p>
+      <w:pPr>
+        <w:pStyle w:val="ListParagraph"/>
+        <w:numPr>
+          <w:ilvl w:val="0"/>
+          <w:numId w:val="9"/>
+        </w:numPr>
+        <w:rPr>
+          <w:sz w:val="24"/>
+          <w:szCs w:val="24"/>
+        </w:rPr>
+      </w:pPr>
+      <w:r>
+        <w:rPr>
+          <w:sz w:val="24"/>
+          <w:szCs w:val="24"/>
+        </w:rPr>
+        <w:t>What is preloaded state and initial state</w:t>
+      </w:r>
+      <w:r>
+        <w:rPr>
+          <w:sz w:val="24"/>
+          <w:szCs w:val="24"/>
+        </w:rPr>
+        <w:t xml:space="preserve"> in configure store function</w:t>
+      </w:r>
+      <w:r>
+        <w:rPr>
+          <w:sz w:val="24"/>
+          <w:szCs w:val="24"/>
+        </w:rPr>
+        <w:t>?</w:t>
+      </w:r>
+    </w:p>
+    <w:p>
+      <w:pPr>
+        <w:rPr>
+          <w:sz w:val="24"/>
+          <w:szCs w:val="24"/>
+        </w:rPr>
+      </w:pPr>
+    </w:p>
+    <w:p>
+      <w:pPr>
+        <w:rPr>
+          <w:sz w:val="24"/>
+          <w:szCs w:val="24"/>
+        </w:rPr>
+      </w:pPr>
+    </w:p>
+    <w:p>
+      <w:pPr>
+        <w:rPr>
+          <w:sz w:val="24"/>
+          <w:szCs w:val="24"/>
+        </w:rPr>
+      </w:pPr>
+    </w:p>
+    <w:p>
+      <w:pPr>
+        <w:rPr>
+          <w:sz w:val="24"/>
+          <w:szCs w:val="24"/>
+        </w:rPr>
+      </w:pPr>
+    </w:p>
+    <w:p>
+      <w:pPr>
+        <w:rPr>
+          <w:rFonts w:cstheme="minorHAnsi"/>
           <w:b/>
           <w:bCs/>
           <w:sz w:val="24"/>
           <w:szCs w:val="24"/>
         </w:rPr>
-        <w:t>:</w:t>
-      </w:r>
-    </w:p>
-    <w:p>
-      <w:pPr>
-        <w:pStyle w:val="ListParagraph"/>
-        <w:numPr>
-          <w:ilvl w:val="0"/>
-          <w:numId w:val="2"/>
-        </w:numPr>
-        <w:rPr>
-          <w:sz w:val="24"/>
-          <w:szCs w:val="24"/>
-        </w:rPr>
-      </w:pPr>
-      <w:r>
-        <w:rPr>
-          <w:sz w:val="24"/>
-          <w:szCs w:val="24"/>
-        </w:rPr>
-        <w:t>What is hook and why do we need it?</w:t>
-      </w:r>
-    </w:p>
-    <w:p>
-      <w:pPr>
-        <w:pStyle w:val="ListParagraph"/>
-        <w:numPr>
-          <w:ilvl w:val="0"/>
-          <w:numId w:val="2"/>
-        </w:numPr>
-        <w:rPr>
-          <w:sz w:val="24"/>
-          <w:szCs w:val="24"/>
-        </w:rPr>
-      </w:pPr>
-      <w:r>
-        <w:rPr>
-          <w:sz w:val="24"/>
-          <w:szCs w:val="24"/>
-        </w:rPr>
-        <w:t>useState</w:t>
-      </w:r>
-      <w:r>
-        <w:rPr>
-          <w:sz w:val="24"/>
-          <w:szCs w:val="24"/>
-        </w:rPr>
-        <w:t xml:space="preserve"> () </w:t>
-      </w:r>
-    </w:p>
-    <w:p>
-      <w:pPr>
-        <w:pStyle w:val="ListParagraph"/>
-        <w:numPr>
-          <w:ilvl w:val="1"/>
-          <w:numId w:val="2"/>
-        </w:numPr>
-        <w:rPr>
-          <w:sz w:val="24"/>
-          <w:szCs w:val="24"/>
-        </w:rPr>
-      </w:pPr>
-      <w:r>
-        <w:rPr>
-          <w:sz w:val="24"/>
-          <w:szCs w:val="24"/>
-        </w:rPr>
-        <w:t>What is useState?</w:t>
-      </w:r>
-    </w:p>
-    <w:p>
-      <w:pPr>
-        <w:pStyle w:val="ListParagraph"/>
-        <w:numPr>
-          <w:ilvl w:val="1"/>
-          <w:numId w:val="2"/>
-        </w:numPr>
-        <w:rPr>
-          <w:sz w:val="24"/>
-          <w:szCs w:val="24"/>
-        </w:rPr>
-      </w:pPr>
-      <w:r>
-        <w:rPr>
-          <w:sz w:val="24"/>
-          <w:szCs w:val="24"/>
-        </w:rPr>
-        <w:t>What are all the hidden tricks of useState hook?</w:t>
-      </w:r>
-    </w:p>
-    <w:p>
-      <w:pPr>
-        <w:pStyle w:val="ListParagraph"/>
-        <w:numPr>
-          <w:ilvl w:val="1"/>
-          <w:numId w:val="2"/>
-        </w:numPr>
-        <w:rPr>
-          <w:sz w:val="24"/>
-          <w:szCs w:val="24"/>
-        </w:rPr>
-      </w:pPr>
-      <w:r>
-        <w:rPr>
-          <w:sz w:val="24"/>
-          <w:szCs w:val="24"/>
-        </w:rPr>
-        <w:t>How useState can be implemented with primitive and non-primitive values?</w:t>
-      </w:r>
-    </w:p>
-    <w:p>
-      <w:pPr>
-        <w:pStyle w:val="ListParagraph"/>
-        <w:numPr>
-          <w:ilvl w:val="1"/>
-          <w:numId w:val="2"/>
-        </w:numPr>
-        <w:rPr>
-          <w:sz w:val="24"/>
-          <w:szCs w:val="24"/>
-        </w:rPr>
-      </w:pPr>
-      <w:r>
-        <w:rPr>
-          <w:sz w:val="24"/>
-          <w:szCs w:val="24"/>
-        </w:rPr>
-        <w:t>Drawbacks/Limitations of useState hook.</w:t>
-      </w:r>
-    </w:p>
-    <w:p>
-      <w:pPr>
-        <w:pStyle w:val="ListParagraph"/>
-        <w:numPr>
-          <w:ilvl w:val="0"/>
-          <w:numId w:val="2"/>
-        </w:numPr>
-        <w:rPr>
-          <w:sz w:val="24"/>
-          <w:szCs w:val="24"/>
-        </w:rPr>
-      </w:pPr>
-      <w:r>
-        <w:rPr>
-          <w:sz w:val="24"/>
-          <w:szCs w:val="24"/>
-        </w:rPr>
-        <w:t>useEffect ()</w:t>
-      </w:r>
-    </w:p>
-    <w:p>
-      <w:pPr>
-        <w:pStyle w:val="ListParagraph"/>
-        <w:numPr>
-          <w:ilvl w:val="1"/>
-          <w:numId w:val="2"/>
-        </w:numPr>
-        <w:rPr>
-          <w:sz w:val="24"/>
-          <w:szCs w:val="24"/>
-        </w:rPr>
-      </w:pPr>
-      <w:r>
-        <w:rPr>
-          <w:sz w:val="24"/>
-          <w:szCs w:val="24"/>
-        </w:rPr>
-        <w:t>what is useEffect ()?</w:t>
-      </w:r>
-    </w:p>
-    <w:p>
-      <w:pPr>
-        <w:pStyle w:val="ListParagraph"/>
-        <w:numPr>
-          <w:ilvl w:val="1"/>
-          <w:numId w:val="2"/>
-        </w:numPr>
-        <w:rPr>
-          <w:sz w:val="24"/>
-          <w:szCs w:val="24"/>
-        </w:rPr>
-      </w:pPr>
-      <w:r>
-        <w:rPr>
-          <w:sz w:val="24"/>
-          <w:szCs w:val="24"/>
-        </w:rPr>
-        <w:lastRenderedPageBreak/>
-        <w:t xml:space="preserve">How many parameters </w:t>
-      </w:r>
-      <w:r>
-        <w:rPr>
-          <w:sz w:val="24"/>
-          <w:szCs w:val="24"/>
-        </w:rPr>
-        <w:t>it can hold?</w:t>
-      </w:r>
-    </w:p>
-    <w:p>
-      <w:pPr>
-        <w:pStyle w:val="ListParagraph"/>
-        <w:numPr>
-          <w:ilvl w:val="1"/>
-          <w:numId w:val="2"/>
-        </w:numPr>
-        <w:rPr>
-          <w:sz w:val="24"/>
-          <w:szCs w:val="24"/>
-        </w:rPr>
-      </w:pPr>
-      <w:r>
-        <w:rPr>
-          <w:sz w:val="24"/>
-          <w:szCs w:val="24"/>
-        </w:rPr>
-        <w:t>Does it return any values?</w:t>
-      </w:r>
-    </w:p>
-    <w:p>
-      <w:pPr>
-        <w:pStyle w:val="ListParagraph"/>
-        <w:numPr>
-          <w:ilvl w:val="1"/>
-          <w:numId w:val="2"/>
-        </w:numPr>
-        <w:rPr>
-          <w:sz w:val="24"/>
-          <w:szCs w:val="24"/>
-        </w:rPr>
-      </w:pPr>
-      <w:r>
-        <w:rPr>
-          <w:sz w:val="24"/>
-          <w:szCs w:val="24"/>
-        </w:rPr>
-        <w:t xml:space="preserve">How to </w:t>
-      </w:r>
-      <w:r>
-        <w:rPr>
-          <w:sz w:val="24"/>
-          <w:szCs w:val="24"/>
-        </w:rPr>
-        <w:t>invoke</w:t>
-      </w:r>
-      <w:r>
-        <w:rPr>
-          <w:sz w:val="24"/>
-          <w:szCs w:val="24"/>
-        </w:rPr>
-        <w:t xml:space="preserve"> useEffect () depends </w:t>
-      </w:r>
-      <w:r>
-        <w:rPr>
-          <w:sz w:val="24"/>
-          <w:szCs w:val="24"/>
-        </w:rPr>
-        <w:t>on</w:t>
-      </w:r>
-      <w:r>
-        <w:rPr>
-          <w:sz w:val="24"/>
-          <w:szCs w:val="24"/>
-        </w:rPr>
-        <w:t xml:space="preserve"> only some action, not for every re-render?</w:t>
-      </w:r>
-      <w:r>
-        <w:rPr>
-          <w:sz w:val="24"/>
-          <w:szCs w:val="24"/>
-        </w:rPr>
-        <w:t xml:space="preserve"> </w:t>
-      </w:r>
-      <w:r>
-        <w:rPr>
-          <w:sz w:val="24"/>
-          <w:szCs w:val="24"/>
-        </w:rPr>
-        <w:t xml:space="preserve">Conditionally run </w:t>
-      </w:r>
-      <w:r>
-        <w:rPr>
-          <w:sz w:val="24"/>
-          <w:szCs w:val="24"/>
-        </w:rPr>
-        <w:t>other way to update state w/ previous state value</w:t>
-      </w:r>
-      <w:r>
-        <w:rPr>
-          <w:sz w:val="24"/>
-          <w:szCs w:val="24"/>
-        </w:rPr>
-        <w:t xml:space="preserve"> (so you no need to explicitly mention it on dependency array)</w:t>
-      </w:r>
-      <w:r>
-        <w:rPr>
-          <w:sz w:val="24"/>
-          <w:szCs w:val="24"/>
-        </w:rPr>
-        <w:t>.</w:t>
-      </w:r>
-    </w:p>
-    <w:p>
-      <w:pPr>
-        <w:pStyle w:val="ListParagraph"/>
-        <w:numPr>
-          <w:ilvl w:val="1"/>
-          <w:numId w:val="2"/>
-        </w:numPr>
-        <w:rPr>
-          <w:sz w:val="24"/>
-          <w:szCs w:val="24"/>
-        </w:rPr>
-      </w:pPr>
-      <w:r>
-        <w:rPr>
-          <w:sz w:val="24"/>
-          <w:szCs w:val="24"/>
-        </w:rPr>
-        <w:t>How to call useEffect () only once in react</w:t>
-      </w:r>
-      <w:r>
-        <w:rPr>
-          <w:sz w:val="24"/>
-          <w:szCs w:val="24"/>
-        </w:rPr>
-        <w:t xml:space="preserve"> – replacement of componentDidMount</w:t>
-      </w:r>
-      <w:r>
-        <w:rPr>
-          <w:sz w:val="24"/>
-          <w:szCs w:val="24"/>
-        </w:rPr>
-        <w:t xml:space="preserve"> </w:t>
-      </w:r>
-    </w:p>
-    <w:p>
-      <w:pPr>
-        <w:pStyle w:val="ListParagraph"/>
-        <w:numPr>
-          <w:ilvl w:val="1"/>
-          <w:numId w:val="2"/>
-        </w:numPr>
-        <w:rPr>
-          <w:sz w:val="24"/>
-          <w:szCs w:val="24"/>
-        </w:rPr>
-      </w:pPr>
-      <w:r>
-        <w:rPr>
-          <w:sz w:val="24"/>
-          <w:szCs w:val="24"/>
-        </w:rPr>
-        <w:t>useEffect () with clean up</w:t>
-      </w:r>
-      <w:r>
-        <w:rPr>
-          <w:sz w:val="24"/>
-          <w:szCs w:val="24"/>
-        </w:rPr>
-        <w:t xml:space="preserve"> – replacement of componentWillUnmount</w:t>
-      </w:r>
-    </w:p>
-    <w:p>
-      <w:pPr>
-        <w:pStyle w:val="ListParagraph"/>
-        <w:numPr>
-          <w:ilvl w:val="0"/>
-          <w:numId w:val="2"/>
-        </w:numPr>
-        <w:rPr>
-          <w:sz w:val="24"/>
-          <w:szCs w:val="24"/>
-        </w:rPr>
-      </w:pPr>
-      <w:r>
-        <w:rPr>
-          <w:sz w:val="24"/>
-          <w:szCs w:val="24"/>
-        </w:rPr>
-        <w:t>useContext ()</w:t>
-      </w:r>
-    </w:p>
-    <w:p>
-      <w:pPr>
-        <w:pStyle w:val="ListParagraph"/>
-        <w:numPr>
-          <w:ilvl w:val="0"/>
-          <w:numId w:val="2"/>
-        </w:numPr>
-        <w:rPr>
-          <w:sz w:val="24"/>
-          <w:szCs w:val="24"/>
-        </w:rPr>
-      </w:pPr>
-      <w:r>
-        <w:rPr>
-          <w:sz w:val="24"/>
-          <w:szCs w:val="24"/>
-        </w:rPr>
-        <w:t>useReducer ()</w:t>
-      </w:r>
-    </w:p>
-    <w:p>
-      <w:pPr>
-        <w:pStyle w:val="ListParagraph"/>
-        <w:numPr>
-          <w:ilvl w:val="1"/>
-          <w:numId w:val="2"/>
-        </w:numPr>
-        <w:rPr>
-          <w:sz w:val="24"/>
-          <w:szCs w:val="24"/>
-        </w:rPr>
-      </w:pPr>
-      <w:r>
-        <w:rPr>
-          <w:sz w:val="24"/>
-          <w:szCs w:val="24"/>
-        </w:rPr>
-        <w:t>How to implement simple useReducer</w:t>
-      </w:r>
-    </w:p>
-    <w:p>
-      <w:pPr>
-        <w:pStyle w:val="ListParagraph"/>
-        <w:numPr>
-          <w:ilvl w:val="1"/>
-          <w:numId w:val="2"/>
-        </w:numPr>
-        <w:rPr>
-          <w:sz w:val="24"/>
-          <w:szCs w:val="24"/>
-        </w:rPr>
-      </w:pPr>
-      <w:r>
-        <w:rPr>
-          <w:sz w:val="24"/>
-          <w:szCs w:val="24"/>
-        </w:rPr>
-        <w:t>How to implement initial-state as object and working w/ useReducer</w:t>
-      </w:r>
-    </w:p>
-    <w:p>
-      <w:pPr>
-        <w:pStyle w:val="ListParagraph"/>
-        <w:numPr>
-          <w:ilvl w:val="1"/>
-          <w:numId w:val="2"/>
-        </w:numPr>
-        <w:rPr>
-          <w:sz w:val="24"/>
-          <w:szCs w:val="24"/>
-        </w:rPr>
-      </w:pPr>
-      <w:r>
-        <w:rPr>
-          <w:sz w:val="24"/>
-          <w:szCs w:val="24"/>
-        </w:rPr>
-        <w:t>How to implement action as an object and working w/ useReducer</w:t>
-      </w:r>
-    </w:p>
-    <w:p>
-      <w:pPr>
-        <w:pStyle w:val="ListParagraph"/>
-        <w:numPr>
-          <w:ilvl w:val="1"/>
-          <w:numId w:val="2"/>
-        </w:numPr>
-        <w:rPr>
-          <w:sz w:val="24"/>
-          <w:szCs w:val="24"/>
-        </w:rPr>
-      </w:pPr>
-      <w:r>
-        <w:rPr>
-          <w:sz w:val="24"/>
-          <w:szCs w:val="24"/>
-        </w:rPr>
-        <w:t xml:space="preserve">How to implement multiple </w:t>
-      </w:r>
-      <w:r>
-        <w:rPr>
-          <w:sz w:val="24"/>
-          <w:szCs w:val="24"/>
-        </w:rPr>
-        <w:t>useReducer</w:t>
-      </w:r>
-    </w:p>
-    <w:p>
-      <w:pPr>
-        <w:pStyle w:val="ListParagraph"/>
-        <w:numPr>
-          <w:ilvl w:val="1"/>
-          <w:numId w:val="2"/>
-        </w:numPr>
-        <w:rPr>
-          <w:sz w:val="24"/>
-          <w:szCs w:val="24"/>
-        </w:rPr>
-      </w:pPr>
-      <w:r>
-        <w:rPr>
-          <w:sz w:val="24"/>
-          <w:szCs w:val="24"/>
-        </w:rPr>
-        <w:t>useReducer + useContext</w:t>
-      </w:r>
-    </w:p>
-    <w:p>
-      <w:pPr>
-        <w:pStyle w:val="ListParagraph"/>
-        <w:numPr>
-          <w:ilvl w:val="1"/>
-          <w:numId w:val="2"/>
-        </w:numPr>
-        <w:rPr>
-          <w:sz w:val="24"/>
-          <w:szCs w:val="24"/>
-        </w:rPr>
-      </w:pPr>
-      <w:r>
-        <w:rPr>
-          <w:sz w:val="24"/>
-          <w:szCs w:val="24"/>
-        </w:rPr>
-        <w:t>useReducer + useEffect</w:t>
-      </w:r>
-    </w:p>
-    <w:p>
-      <w:pPr>
-        <w:pStyle w:val="ListParagraph"/>
-        <w:numPr>
-          <w:ilvl w:val="1"/>
-          <w:numId w:val="2"/>
-        </w:numPr>
-        <w:rPr>
-          <w:sz w:val="24"/>
-          <w:szCs w:val="24"/>
-        </w:rPr>
-      </w:pPr>
-      <w:r>
-        <w:rPr>
-          <w:sz w:val="24"/>
-          <w:szCs w:val="24"/>
-        </w:rPr>
-        <w:t>Difference between useState/useReducer</w:t>
-      </w:r>
-    </w:p>
-    <w:p>
-      <w:pPr>
-        <w:pStyle w:val="ListParagraph"/>
-        <w:numPr>
-          <w:ilvl w:val="0"/>
-          <w:numId w:val="2"/>
-        </w:numPr>
-        <w:rPr>
-          <w:sz w:val="24"/>
-          <w:szCs w:val="24"/>
-        </w:rPr>
-      </w:pPr>
-      <w:r>
-        <w:rPr>
-          <w:sz w:val="24"/>
-          <w:szCs w:val="24"/>
-        </w:rPr>
-        <w:t>useMemo ()</w:t>
-      </w:r>
-    </w:p>
-    <w:p>
-      <w:pPr>
-        <w:pStyle w:val="ListParagraph"/>
-        <w:numPr>
-          <w:ilvl w:val="0"/>
-          <w:numId w:val="2"/>
-        </w:numPr>
-        <w:rPr>
-          <w:sz w:val="24"/>
-          <w:szCs w:val="24"/>
-        </w:rPr>
-      </w:pPr>
-      <w:r>
-        <w:rPr>
-          <w:sz w:val="24"/>
-          <w:szCs w:val="24"/>
-        </w:rPr>
-        <w:t>useCallback ()</w:t>
-      </w:r>
-    </w:p>
-    <w:p>
-      <w:pPr>
-        <w:pStyle w:val="ListParagraph"/>
-        <w:numPr>
-          <w:ilvl w:val="0"/>
-          <w:numId w:val="2"/>
-        </w:numPr>
-        <w:rPr>
-          <w:sz w:val="24"/>
-          <w:szCs w:val="24"/>
-        </w:rPr>
-      </w:pPr>
-      <w:r>
-        <w:rPr>
-          <w:sz w:val="24"/>
-          <w:szCs w:val="24"/>
-        </w:rPr>
-        <w:t>useRef ()</w:t>
-      </w:r>
-    </w:p>
-    <w:p>
-      <w:pPr>
-        <w:pStyle w:val="ListParagraph"/>
-        <w:numPr>
-          <w:ilvl w:val="0"/>
-          <w:numId w:val="2"/>
-        </w:numPr>
-        <w:rPr>
-          <w:sz w:val="24"/>
-          <w:szCs w:val="24"/>
-        </w:rPr>
-      </w:pPr>
-      <w:r>
-        <w:rPr>
-          <w:sz w:val="24"/>
-          <w:szCs w:val="24"/>
-        </w:rPr>
-        <w:t>Custom Hooks Implementation</w:t>
-      </w:r>
-    </w:p>
-    <w:p>
-      <w:pPr>
-        <w:rPr>
+      </w:pPr>
+      <w:r>
+        <w:rPr>
+          <w:rFonts w:cstheme="minorHAnsi"/>
           <w:b/>
           <w:bCs/>
           <w:sz w:val="24"/>
           <w:szCs w:val="24"/>
         </w:rPr>
-      </w:pPr>
-      <w:r>
-        <w:rPr>
-          <w:b/>
-          <w:bCs/>
-          <w:sz w:val="24"/>
-          <w:szCs w:val="24"/>
-        </w:rPr>
-        <w:t>REDUX CONCEPTS</w:t>
-      </w:r>
-    </w:p>
-    <w:p>
-      <w:pPr>
-        <w:pStyle w:val="ListParagraph"/>
-        <w:numPr>
-          <w:ilvl w:val="0"/>
-          <w:numId w:val="3"/>
-        </w:numPr>
-        <w:rPr>
-          <w:sz w:val="24"/>
-          <w:szCs w:val="24"/>
-        </w:rPr>
-      </w:pPr>
-      <w:r>
-        <w:rPr>
-          <w:sz w:val="24"/>
-          <w:szCs w:val="24"/>
-        </w:rPr>
-        <w:t>What is redux and why do we need it?</w:t>
-      </w:r>
-    </w:p>
-    <w:p>
-      <w:pPr>
-        <w:pStyle w:val="ListParagraph"/>
-        <w:numPr>
-          <w:ilvl w:val="0"/>
-          <w:numId w:val="3"/>
-        </w:numPr>
-        <w:rPr>
-          <w:sz w:val="24"/>
-          <w:szCs w:val="24"/>
-        </w:rPr>
-      </w:pPr>
-      <w:r>
-        <w:rPr>
-          <w:sz w:val="24"/>
-          <w:szCs w:val="24"/>
-        </w:rPr>
-        <w:t>What are three core concepts</w:t>
-      </w:r>
-      <w:r>
-        <w:rPr>
-          <w:sz w:val="24"/>
-          <w:szCs w:val="24"/>
-        </w:rPr>
-        <w:t>/principles</w:t>
-      </w:r>
-      <w:r>
-        <w:rPr>
-          <w:sz w:val="24"/>
-          <w:szCs w:val="24"/>
-        </w:rPr>
-        <w:t xml:space="preserve"> of redux</w:t>
-      </w:r>
-      <w:r>
-        <w:rPr>
-          <w:sz w:val="24"/>
-          <w:szCs w:val="24"/>
-        </w:rPr>
-        <w:t>?</w:t>
-      </w:r>
-    </w:p>
-    <w:p>
-      <w:pPr>
-        <w:pStyle w:val="ListParagraph"/>
-        <w:numPr>
-          <w:ilvl w:val="0"/>
-          <w:numId w:val="3"/>
-        </w:numPr>
-        <w:rPr>
-          <w:sz w:val="24"/>
-          <w:szCs w:val="24"/>
-        </w:rPr>
-      </w:pPr>
-      <w:r>
-        <w:rPr>
-          <w:sz w:val="24"/>
-          <w:szCs w:val="24"/>
-        </w:rPr>
-        <w:t>Multiple reducers w/ combine Reducers</w:t>
-      </w:r>
-    </w:p>
-    <w:p>
-      <w:pPr>
-        <w:pStyle w:val="ListParagraph"/>
-        <w:numPr>
-          <w:ilvl w:val="0"/>
-          <w:numId w:val="3"/>
-        </w:numPr>
-        <w:rPr>
-          <w:sz w:val="24"/>
-          <w:szCs w:val="24"/>
-        </w:rPr>
-      </w:pPr>
-      <w:r>
-        <w:rPr>
-          <w:sz w:val="24"/>
-          <w:szCs w:val="24"/>
-        </w:rPr>
-        <w:t>What is middleware?</w:t>
-      </w:r>
-    </w:p>
-    <w:p>
-      <w:pPr>
-        <w:pStyle w:val="ListParagraph"/>
-        <w:numPr>
-          <w:ilvl w:val="0"/>
-          <w:numId w:val="3"/>
-        </w:numPr>
-        <w:rPr>
-          <w:sz w:val="24"/>
-          <w:szCs w:val="24"/>
-        </w:rPr>
-      </w:pPr>
-      <w:r>
-        <w:rPr>
-          <w:sz w:val="24"/>
-          <w:szCs w:val="24"/>
-        </w:rPr>
-        <w:t>What is redux thunk?</w:t>
-      </w:r>
-    </w:p>
-    <w:p>
-      <w:pPr>
-        <w:pStyle w:val="ListParagraph"/>
-        <w:numPr>
-          <w:ilvl w:val="0"/>
-          <w:numId w:val="3"/>
-        </w:numPr>
-        <w:rPr>
-          <w:sz w:val="24"/>
-          <w:szCs w:val="24"/>
-        </w:rPr>
-      </w:pPr>
-      <w:r>
-        <w:rPr>
-          <w:sz w:val="24"/>
-          <w:szCs w:val="24"/>
-        </w:rPr>
-        <w:t>What is immer package?</w:t>
-      </w:r>
-    </w:p>
-    <w:p>
-      <w:pPr>
-        <w:pStyle w:val="ListParagraph"/>
-        <w:numPr>
-          <w:ilvl w:val="0"/>
-          <w:numId w:val="3"/>
-        </w:numPr>
-        <w:rPr>
-          <w:sz w:val="24"/>
-          <w:szCs w:val="24"/>
-        </w:rPr>
-      </w:pPr>
-      <w:r>
-        <w:rPr>
-          <w:sz w:val="24"/>
-          <w:szCs w:val="24"/>
-        </w:rPr>
-        <w:t>What is react redux package?</w:t>
-      </w:r>
-    </w:p>
-    <w:p>
-      <w:pPr>
-        <w:rPr>
-          <w:b/>
-          <w:bCs/>
-          <w:sz w:val="24"/>
-          <w:szCs w:val="24"/>
-        </w:rPr>
-      </w:pPr>
-      <w:r>
-        <w:rPr>
-          <w:b/>
-          <w:bCs/>
-          <w:sz w:val="24"/>
-          <w:szCs w:val="24"/>
-        </w:rPr>
-        <w:t>REDUX TOOLKIT CONCEPTS</w:t>
-      </w:r>
-    </w:p>
-    <w:p>
-      <w:pPr>
-        <w:pStyle w:val="ListParagraph"/>
-        <w:numPr>
-          <w:ilvl w:val="0"/>
-          <w:numId w:val="9"/>
-        </w:numPr>
-        <w:rPr>
-          <w:sz w:val="24"/>
-          <w:szCs w:val="24"/>
-        </w:rPr>
-      </w:pPr>
-      <w:r>
-        <w:rPr>
-          <w:sz w:val="24"/>
-          <w:szCs w:val="24"/>
-        </w:rPr>
-        <w:t>Shortcomings of core redux</w:t>
-      </w:r>
-    </w:p>
-    <w:p>
-      <w:pPr>
-        <w:pStyle w:val="ListParagraph"/>
-        <w:numPr>
-          <w:ilvl w:val="0"/>
-          <w:numId w:val="9"/>
-        </w:numPr>
-        <w:rPr>
-          <w:sz w:val="24"/>
-          <w:szCs w:val="24"/>
-        </w:rPr>
-      </w:pPr>
-      <w:r>
-        <w:rPr>
-          <w:sz w:val="24"/>
-          <w:szCs w:val="24"/>
-        </w:rPr>
-        <w:t>What is redux toolkit? Why do we need it?</w:t>
-      </w:r>
-    </w:p>
-    <w:p>
-      <w:pPr>
-        <w:pStyle w:val="ListParagraph"/>
-        <w:numPr>
-          <w:ilvl w:val="0"/>
-          <w:numId w:val="9"/>
-        </w:numPr>
-        <w:rPr>
-          <w:sz w:val="24"/>
-          <w:szCs w:val="24"/>
-        </w:rPr>
-      </w:pPr>
-      <w:r>
-        <w:rPr>
-          <w:sz w:val="24"/>
-          <w:szCs w:val="24"/>
-        </w:rPr>
-        <w:t>Async actions</w:t>
-      </w:r>
-    </w:p>
-    <w:p>
-      <w:pPr>
-        <w:pStyle w:val="ListParagraph"/>
-        <w:numPr>
-          <w:ilvl w:val="0"/>
-          <w:numId w:val="9"/>
-        </w:numPr>
-        <w:rPr>
-          <w:sz w:val="24"/>
-          <w:szCs w:val="24"/>
-        </w:rPr>
-      </w:pPr>
-      <w:r>
-        <w:rPr>
-          <w:sz w:val="24"/>
-          <w:szCs w:val="24"/>
-        </w:rPr>
-        <w:t>What is preloaded state and initial state</w:t>
-      </w:r>
-      <w:r>
-        <w:rPr>
-          <w:sz w:val="24"/>
-          <w:szCs w:val="24"/>
-        </w:rPr>
-        <w:t xml:space="preserve"> in configure store function</w:t>
-      </w:r>
-      <w:r>
-        <w:rPr>
-          <w:sz w:val="24"/>
-          <w:szCs w:val="24"/>
-        </w:rPr>
-        <w:t>?</w:t>
-      </w:r>
-    </w:p>
-    <w:p>
-      <w:pPr>
-        <w:rPr>
-          <w:sz w:val="24"/>
-          <w:szCs w:val="24"/>
-        </w:rPr>
-      </w:pPr>
-    </w:p>
-    <w:p>
-      <w:pPr>
-        <w:rPr>
-          <w:sz w:val="24"/>
-          <w:szCs w:val="24"/>
-        </w:rPr>
-      </w:pPr>
-    </w:p>
-    <w:p>
-      <w:pPr>
-        <w:rPr>
-          <w:sz w:val="24"/>
-          <w:szCs w:val="24"/>
-        </w:rPr>
-      </w:pPr>
-    </w:p>
-    <w:p>
-      <w:pPr>
-        <w:rPr>
-          <w:sz w:val="24"/>
-          <w:szCs w:val="24"/>
-        </w:rPr>
-      </w:pPr>
-    </w:p>
-    <w:p>
-      <w:pPr>
-        <w:rPr>
-          <w:rFonts w:cstheme="minorHAnsi"/>
-          <w:b/>
-          <w:bCs/>
-          <w:sz w:val="24"/>
-          <w:szCs w:val="24"/>
-        </w:rPr>
-      </w:pPr>
-      <w:r>
-        <w:rPr>
-          <w:rFonts w:cstheme="minorHAnsi"/>
-          <w:b/>
-          <w:bCs/>
-          <w:sz w:val="24"/>
-          <w:szCs w:val="24"/>
-        </w:rPr>
         <w:t>React Typescript:</w:t>
       </w:r>
     </w:p>
@@ -2942,7 +2119,6 @@
           <w:sz w:val="24"/>
           <w:szCs w:val="24"/>
         </w:rPr>
-        <w:lastRenderedPageBreak/>
         <w:t xml:space="preserve">Basic Prop Types – </w:t>
       </w:r>
       <w:r>
@@ -3177,7 +2353,16 @@
           <w:sz w:val="24"/>
           <w:szCs w:val="24"/>
         </w:rPr>
-        <w:t>: R</w:t>
+        <w:t xml:space="preserve">: </w:t>
+      </w:r>
+      <w:proofErr w:type="spellStart"/>
+      <w:r>
+        <w:rPr>
+          <w:rFonts w:cstheme="minorHAnsi"/>
+          <w:sz w:val="24"/>
+          <w:szCs w:val="24"/>
+        </w:rPr>
+        <w:t>R</w:t>
       </w:r>
       <w:r>
         <w:rPr>
@@ -3187,6 +2372,7 @@
         </w:rPr>
         <w:t>eactNode</w:t>
       </w:r>
+      <w:proofErr w:type="spellEnd"/>
     </w:p>
     <w:p>
       <w:pPr>
@@ -3225,6 +2411,7 @@
         </w:rPr>
         <w:t xml:space="preserve"> </w:t>
       </w:r>
+      <w:proofErr w:type="spellStart"/>
       <w:r>
         <w:rPr>
           <w:rFonts w:cstheme="minorHAnsi"/>
@@ -3233,6 +2420,7 @@
         </w:rPr>
         <w:t>ReactNode</w:t>
       </w:r>
+      <w:proofErr w:type="spellEnd"/>
     </w:p>
     <w:p>
       <w:pPr>
@@ -3315,8 +2503,18 @@
           <w:sz w:val="24"/>
           <w:szCs w:val="24"/>
         </w:rPr>
-        <w:t xml:space="preserve"> = React. ComponentType</w:t>
-      </w:r>
+        <w:t xml:space="preserve"> = React. </w:t>
+      </w:r>
+      <w:proofErr w:type="spellStart"/>
+      <w:r>
+        <w:rPr>
+          <w:rFonts w:cstheme="minorHAnsi"/>
+          <w:sz w:val="24"/>
+          <w:szCs w:val="24"/>
+        </w:rPr>
+        <w:t>ComponentType</w:t>
+      </w:r>
+      <w:proofErr w:type="spellEnd"/>
     </w:p>
     <w:p>
       <w:pPr>
@@ -3469,6 +2667,7 @@
         </w:rPr>
         <w:t xml:space="preserve"> </w:t>
       </w:r>
+      <w:proofErr w:type="spellStart"/>
       <w:r>
         <w:rPr>
           <w:rFonts w:cstheme="minorHAnsi"/>
@@ -3477,6 +2676,7 @@
         </w:rPr>
         <w:t>CSSProperties</w:t>
       </w:r>
+      <w:proofErr w:type="spellEnd"/>
     </w:p>
     <w:p>
       <w:pPr>
@@ -4066,618 +3266,6 @@
           <w:szCs w:val="24"/>
         </w:rPr>
       </w:pPr>
-    </w:p>
-    <w:p>
-      <w:pPr>
-        <w:rPr>
-          <w:rFonts w:cstheme="minorHAnsi"/>
-          <w:b/>
-          <w:bCs/>
-          <w:sz w:val="24"/>
-          <w:szCs w:val="24"/>
-        </w:rPr>
-      </w:pPr>
-      <w:r>
-        <w:rPr>
-          <w:rFonts w:cstheme="minorHAnsi"/>
-          <w:b/>
-          <w:bCs/>
-          <w:sz w:val="24"/>
-          <w:szCs w:val="24"/>
-        </w:rPr>
-        <w:t xml:space="preserve">REACT ROUTER </w:t>
-      </w:r>
-      <w:r>
-        <w:rPr>
-          <w:rFonts w:cstheme="minorHAnsi"/>
-          <w:b/>
-          <w:bCs/>
-          <w:sz w:val="24"/>
-          <w:szCs w:val="24"/>
-        </w:rPr>
-        <w:t>CONCEPTS</w:t>
-      </w:r>
-    </w:p>
-    <w:p>
-      <w:pPr>
-        <w:pStyle w:val="ListParagraph"/>
-        <w:numPr>
-          <w:ilvl w:val="0"/>
-          <w:numId w:val="7"/>
-        </w:numPr>
-        <w:rPr>
-          <w:rFonts w:cstheme="minorHAnsi"/>
-          <w:sz w:val="24"/>
-          <w:szCs w:val="24"/>
-        </w:rPr>
-      </w:pPr>
-      <w:r>
-        <w:rPr>
-          <w:rFonts w:cstheme="minorHAnsi"/>
-          <w:sz w:val="24"/>
-          <w:szCs w:val="24"/>
-        </w:rPr>
-        <w:lastRenderedPageBreak/>
-        <w:t xml:space="preserve">Configuring </w:t>
-      </w:r>
-      <w:r>
-        <w:rPr>
-          <w:rFonts w:cstheme="minorHAnsi"/>
-          <w:sz w:val="24"/>
-          <w:szCs w:val="24"/>
-        </w:rPr>
-        <w:t>r</w:t>
-      </w:r>
-      <w:r>
-        <w:rPr>
-          <w:rFonts w:cstheme="minorHAnsi"/>
-          <w:sz w:val="24"/>
-          <w:szCs w:val="24"/>
-        </w:rPr>
-        <w:t>outes</w:t>
-      </w:r>
-    </w:p>
-    <w:p>
-      <w:pPr>
-        <w:pStyle w:val="ListParagraph"/>
-        <w:numPr>
-          <w:ilvl w:val="1"/>
-          <w:numId w:val="7"/>
-        </w:numPr>
-        <w:rPr>
-          <w:rFonts w:cstheme="minorHAnsi"/>
-          <w:sz w:val="24"/>
-          <w:szCs w:val="24"/>
-        </w:rPr>
-      </w:pPr>
-      <w:r>
-        <w:rPr>
-          <w:rFonts w:cstheme="minorHAnsi"/>
-          <w:sz w:val="24"/>
-          <w:szCs w:val="24"/>
-        </w:rPr>
-        <w:t>BrowserRouter</w:t>
-      </w:r>
-      <w:r>
-        <w:rPr>
-          <w:rFonts w:cstheme="minorHAnsi"/>
-          <w:sz w:val="24"/>
-          <w:szCs w:val="24"/>
-        </w:rPr>
-        <w:t>, Routes, Route</w:t>
-      </w:r>
-      <w:r>
-        <w:rPr>
-          <w:rFonts w:cstheme="minorHAnsi"/>
-          <w:sz w:val="24"/>
-          <w:szCs w:val="24"/>
-        </w:rPr>
-        <w:t xml:space="preserve"> Component</w:t>
-      </w:r>
-    </w:p>
-    <w:p>
-      <w:pPr>
-        <w:pStyle w:val="ListParagraph"/>
-        <w:numPr>
-          <w:ilvl w:val="1"/>
-          <w:numId w:val="7"/>
-        </w:numPr>
-        <w:rPr>
-          <w:rFonts w:cstheme="minorHAnsi"/>
-          <w:sz w:val="24"/>
-          <w:szCs w:val="24"/>
-        </w:rPr>
-      </w:pPr>
-      <w:r>
-        <w:rPr>
-          <w:rFonts w:cstheme="minorHAnsi"/>
-          <w:sz w:val="24"/>
-          <w:szCs w:val="24"/>
-        </w:rPr>
-        <w:t>Link</w:t>
-      </w:r>
-      <w:r>
-        <w:rPr>
-          <w:rFonts w:cstheme="minorHAnsi"/>
-          <w:sz w:val="24"/>
-          <w:szCs w:val="24"/>
-        </w:rPr>
-        <w:t>, NavL</w:t>
-      </w:r>
-      <w:r>
-        <w:rPr>
-          <w:rFonts w:cstheme="minorHAnsi"/>
-          <w:sz w:val="24"/>
-          <w:szCs w:val="24"/>
-        </w:rPr>
-        <w:t>ink</w:t>
-      </w:r>
-      <w:r>
-        <w:rPr>
-          <w:rFonts w:cstheme="minorHAnsi"/>
-          <w:sz w:val="24"/>
-          <w:szCs w:val="24"/>
-        </w:rPr>
-        <w:t xml:space="preserve"> Component</w:t>
-      </w:r>
-    </w:p>
-    <w:p>
-      <w:pPr>
-        <w:pStyle w:val="ListParagraph"/>
-        <w:numPr>
-          <w:ilvl w:val="1"/>
-          <w:numId w:val="7"/>
-        </w:numPr>
-        <w:rPr>
-          <w:rFonts w:cstheme="minorHAnsi"/>
-          <w:sz w:val="24"/>
-          <w:szCs w:val="24"/>
-        </w:rPr>
-      </w:pPr>
-      <w:r>
-        <w:rPr>
-          <w:rFonts w:cstheme="minorHAnsi"/>
-          <w:sz w:val="24"/>
-          <w:szCs w:val="24"/>
-        </w:rPr>
-        <w:t>HashRouter, MemoryRouter</w:t>
-      </w:r>
-      <w:r>
-        <w:rPr>
-          <w:rFonts w:cstheme="minorHAnsi"/>
-          <w:sz w:val="24"/>
-          <w:szCs w:val="24"/>
-        </w:rPr>
-        <w:t xml:space="preserve"> Component</w:t>
-      </w:r>
-    </w:p>
-    <w:p>
-      <w:pPr>
-        <w:pStyle w:val="ListParagraph"/>
-        <w:numPr>
-          <w:ilvl w:val="1"/>
-          <w:numId w:val="7"/>
-        </w:numPr>
-        <w:rPr>
-          <w:rFonts w:cstheme="minorHAnsi"/>
-          <w:sz w:val="24"/>
-          <w:szCs w:val="24"/>
-        </w:rPr>
-      </w:pPr>
-      <w:r>
-        <w:rPr>
-          <w:rFonts w:cstheme="minorHAnsi"/>
-          <w:sz w:val="24"/>
-          <w:szCs w:val="24"/>
-        </w:rPr>
-        <w:t>Navigate Component</w:t>
-      </w:r>
-    </w:p>
-    <w:p>
-      <w:pPr>
-        <w:pStyle w:val="ListParagraph"/>
-        <w:numPr>
-          <w:ilvl w:val="1"/>
-          <w:numId w:val="7"/>
-        </w:numPr>
-        <w:rPr>
-          <w:rFonts w:cstheme="minorHAnsi"/>
-          <w:sz w:val="24"/>
-          <w:szCs w:val="24"/>
-        </w:rPr>
-      </w:pPr>
-      <w:r>
-        <w:rPr>
-          <w:rFonts w:cstheme="minorHAnsi"/>
-          <w:sz w:val="24"/>
-          <w:szCs w:val="24"/>
-        </w:rPr>
-        <w:t>Relative Links shouldn’t start with /</w:t>
-      </w:r>
-    </w:p>
-    <w:p>
-      <w:pPr>
-        <w:pStyle w:val="ListParagraph"/>
-        <w:numPr>
-          <w:ilvl w:val="0"/>
-          <w:numId w:val="7"/>
-        </w:numPr>
-        <w:rPr>
-          <w:rFonts w:cstheme="minorHAnsi"/>
-          <w:sz w:val="24"/>
-          <w:szCs w:val="24"/>
-        </w:rPr>
-      </w:pPr>
-      <w:r>
-        <w:rPr>
-          <w:rFonts w:cstheme="minorHAnsi"/>
-          <w:sz w:val="24"/>
-          <w:szCs w:val="24"/>
-        </w:rPr>
-        <w:t>Navigating programmatically</w:t>
-      </w:r>
-    </w:p>
-    <w:p>
-      <w:pPr>
-        <w:pStyle w:val="ListParagraph"/>
-        <w:numPr>
-          <w:ilvl w:val="1"/>
-          <w:numId w:val="7"/>
-        </w:numPr>
-        <w:rPr>
-          <w:rFonts w:cstheme="minorHAnsi"/>
-          <w:sz w:val="24"/>
-          <w:szCs w:val="24"/>
-        </w:rPr>
-      </w:pPr>
-      <w:r>
-        <w:rPr>
-          <w:rFonts w:cstheme="minorHAnsi"/>
-          <w:sz w:val="24"/>
-          <w:szCs w:val="24"/>
-        </w:rPr>
-        <w:t xml:space="preserve">Navigating on button click – using useNavigate </w:t>
-      </w:r>
-      <w:r>
-        <w:rPr>
-          <w:rFonts w:cstheme="minorHAnsi"/>
-          <w:sz w:val="24"/>
-          <w:szCs w:val="24"/>
-        </w:rPr>
-        <w:t>H</w:t>
-      </w:r>
-      <w:r>
-        <w:rPr>
-          <w:rFonts w:cstheme="minorHAnsi"/>
-          <w:sz w:val="24"/>
-          <w:szCs w:val="24"/>
-        </w:rPr>
-        <w:t>ook</w:t>
-      </w:r>
-    </w:p>
-    <w:p>
-      <w:pPr>
-        <w:pStyle w:val="ListParagraph"/>
-        <w:numPr>
-          <w:ilvl w:val="1"/>
-          <w:numId w:val="7"/>
-        </w:numPr>
-        <w:rPr>
-          <w:rFonts w:cstheme="minorHAnsi"/>
-          <w:sz w:val="24"/>
-          <w:szCs w:val="24"/>
-        </w:rPr>
-      </w:pPr>
-      <w:r>
-        <w:rPr>
-          <w:rFonts w:cstheme="minorHAnsi"/>
-          <w:sz w:val="24"/>
-          <w:szCs w:val="24"/>
-        </w:rPr>
-        <w:t>Navigating back to previously rendered page</w:t>
-      </w:r>
-    </w:p>
-    <w:p>
-      <w:pPr>
-        <w:pStyle w:val="ListParagraph"/>
-        <w:numPr>
-          <w:ilvl w:val="1"/>
-          <w:numId w:val="7"/>
-        </w:numPr>
-        <w:rPr>
-          <w:rFonts w:cstheme="minorHAnsi"/>
-          <w:sz w:val="24"/>
-          <w:szCs w:val="24"/>
-        </w:rPr>
-      </w:pPr>
-      <w:r>
-        <w:rPr>
-          <w:rFonts w:cstheme="minorHAnsi"/>
-          <w:sz w:val="24"/>
-          <w:szCs w:val="24"/>
-        </w:rPr>
-        <w:t>u</w:t>
-      </w:r>
-      <w:r>
-        <w:rPr>
-          <w:rFonts w:cstheme="minorHAnsi"/>
-          <w:sz w:val="24"/>
-          <w:szCs w:val="24"/>
-        </w:rPr>
-        <w:t>seLocation Hook</w:t>
-      </w:r>
-    </w:p>
-    <w:p>
-      <w:pPr>
-        <w:pStyle w:val="ListParagraph"/>
-        <w:numPr>
-          <w:ilvl w:val="0"/>
-          <w:numId w:val="7"/>
-        </w:numPr>
-        <w:rPr>
-          <w:rFonts w:cstheme="minorHAnsi"/>
-          <w:sz w:val="24"/>
-          <w:szCs w:val="24"/>
-        </w:rPr>
-      </w:pPr>
-      <w:r>
-        <w:rPr>
-          <w:rFonts w:cstheme="minorHAnsi"/>
-          <w:sz w:val="24"/>
-          <w:szCs w:val="24"/>
-        </w:rPr>
-        <w:t>Match Route</w:t>
-      </w:r>
-      <w:r>
-        <w:rPr>
-          <w:rFonts w:cstheme="minorHAnsi"/>
-          <w:sz w:val="24"/>
-          <w:szCs w:val="24"/>
-        </w:rPr>
-        <w:t>/Page Not Found</w:t>
-      </w:r>
-      <w:r>
-        <w:rPr>
-          <w:rFonts w:cstheme="minorHAnsi"/>
-          <w:sz w:val="24"/>
-          <w:szCs w:val="24"/>
-        </w:rPr>
-        <w:t xml:space="preserve"> – using (*)</w:t>
-      </w:r>
-    </w:p>
-    <w:p>
-      <w:pPr>
-        <w:pStyle w:val="ListParagraph"/>
-        <w:numPr>
-          <w:ilvl w:val="0"/>
-          <w:numId w:val="7"/>
-        </w:numPr>
-        <w:rPr>
-          <w:rFonts w:cstheme="minorHAnsi"/>
-          <w:sz w:val="24"/>
-          <w:szCs w:val="24"/>
-        </w:rPr>
-      </w:pPr>
-      <w:r>
-        <w:rPr>
-          <w:rFonts w:cstheme="minorHAnsi"/>
-          <w:sz w:val="24"/>
-          <w:szCs w:val="24"/>
-        </w:rPr>
-        <w:t>Nested routes</w:t>
-      </w:r>
-    </w:p>
-    <w:p>
-      <w:pPr>
-        <w:pStyle w:val="ListParagraph"/>
-        <w:numPr>
-          <w:ilvl w:val="0"/>
-          <w:numId w:val="7"/>
-        </w:numPr>
-        <w:rPr>
-          <w:rFonts w:cstheme="minorHAnsi"/>
-          <w:sz w:val="24"/>
-          <w:szCs w:val="24"/>
-        </w:rPr>
-      </w:pPr>
-      <w:r>
-        <w:rPr>
-          <w:rFonts w:cstheme="minorHAnsi"/>
-          <w:sz w:val="24"/>
-          <w:szCs w:val="24"/>
-        </w:rPr>
-        <w:t>Index route</w:t>
-      </w:r>
-    </w:p>
-    <w:p>
-      <w:pPr>
-        <w:pStyle w:val="ListParagraph"/>
-        <w:numPr>
-          <w:ilvl w:val="0"/>
-          <w:numId w:val="7"/>
-        </w:numPr>
-        <w:rPr>
-          <w:rFonts w:cstheme="minorHAnsi"/>
-          <w:sz w:val="24"/>
-          <w:szCs w:val="24"/>
-        </w:rPr>
-      </w:pPr>
-      <w:r>
-        <w:rPr>
-          <w:rFonts w:cstheme="minorHAnsi"/>
-          <w:sz w:val="24"/>
-          <w:szCs w:val="24"/>
-        </w:rPr>
-        <w:t>Dynamic routes</w:t>
-      </w:r>
-    </w:p>
-    <w:p>
-      <w:pPr>
-        <w:pStyle w:val="ListParagraph"/>
-        <w:numPr>
-          <w:ilvl w:val="0"/>
-          <w:numId w:val="7"/>
-        </w:numPr>
-        <w:rPr>
-          <w:rFonts w:cstheme="minorHAnsi"/>
-          <w:sz w:val="24"/>
-          <w:szCs w:val="24"/>
-        </w:rPr>
-      </w:pPr>
-      <w:r>
-        <w:rPr>
-          <w:rFonts w:cstheme="minorHAnsi"/>
-          <w:sz w:val="24"/>
-          <w:szCs w:val="24"/>
-        </w:rPr>
-        <w:t>URL params</w:t>
-      </w:r>
-      <w:r>
-        <w:rPr>
-          <w:rFonts w:cstheme="minorHAnsi"/>
-          <w:sz w:val="24"/>
-          <w:szCs w:val="24"/>
-        </w:rPr>
-        <w:t xml:space="preserve"> – useParams </w:t>
-      </w:r>
-      <w:r>
-        <w:rPr>
-          <w:rFonts w:cstheme="minorHAnsi"/>
-          <w:sz w:val="24"/>
-          <w:szCs w:val="24"/>
-        </w:rPr>
-        <w:t xml:space="preserve">Hook </w:t>
-      </w:r>
-      <w:r>
-        <w:rPr>
-          <w:rFonts w:cstheme="minorHAnsi"/>
-          <w:sz w:val="24"/>
-          <w:szCs w:val="24"/>
-        </w:rPr>
-        <w:t xml:space="preserve">which returns </w:t>
-      </w:r>
-      <w:r>
-        <w:rPr>
-          <w:rFonts w:cstheme="minorHAnsi"/>
-          <w:sz w:val="24"/>
-          <w:szCs w:val="24"/>
-        </w:rPr>
-        <w:t>an</w:t>
-      </w:r>
-      <w:r>
-        <w:rPr>
-          <w:rFonts w:cstheme="minorHAnsi"/>
-          <w:sz w:val="24"/>
-          <w:szCs w:val="24"/>
-        </w:rPr>
-        <w:t xml:space="preserve"> object </w:t>
-      </w:r>
-      <w:r>
-        <w:rPr>
-          <w:rFonts w:cstheme="minorHAnsi"/>
-          <w:sz w:val="24"/>
-          <w:szCs w:val="24"/>
-        </w:rPr>
-        <w:t>of key/value pairs</w:t>
-      </w:r>
-      <w:r>
-        <w:rPr>
-          <w:rFonts w:cstheme="minorHAnsi"/>
-          <w:sz w:val="24"/>
-          <w:szCs w:val="24"/>
-        </w:rPr>
-        <w:t xml:space="preserve"> from URL</w:t>
-      </w:r>
-    </w:p>
-    <w:p>
-      <w:pPr>
-        <w:pStyle w:val="ListParagraph"/>
-        <w:numPr>
-          <w:ilvl w:val="0"/>
-          <w:numId w:val="7"/>
-        </w:numPr>
-        <w:rPr>
-          <w:rFonts w:cstheme="minorHAnsi"/>
-          <w:sz w:val="24"/>
-          <w:szCs w:val="24"/>
-        </w:rPr>
-      </w:pPr>
-      <w:r>
-        <w:rPr>
-          <w:rFonts w:cstheme="minorHAnsi"/>
-          <w:sz w:val="24"/>
-          <w:szCs w:val="24"/>
-        </w:rPr>
-        <w:t xml:space="preserve">Search params </w:t>
-      </w:r>
-      <w:r>
-        <w:rPr>
-          <w:rFonts w:cstheme="minorHAnsi"/>
-          <w:sz w:val="24"/>
-          <w:szCs w:val="24"/>
-        </w:rPr>
-        <w:t>–</w:t>
-      </w:r>
-      <w:r>
-        <w:rPr>
-          <w:rFonts w:cstheme="minorHAnsi"/>
-          <w:sz w:val="24"/>
-          <w:szCs w:val="24"/>
-        </w:rPr>
-        <w:t xml:space="preserve"> useSearchParams</w:t>
-      </w:r>
-      <w:r>
-        <w:rPr>
-          <w:rFonts w:cstheme="minorHAnsi"/>
-          <w:sz w:val="24"/>
-          <w:szCs w:val="24"/>
-        </w:rPr>
-        <w:t xml:space="preserve"> Hook</w:t>
-      </w:r>
-    </w:p>
-    <w:p>
-      <w:pPr>
-        <w:pStyle w:val="ListParagraph"/>
-        <w:numPr>
-          <w:ilvl w:val="0"/>
-          <w:numId w:val="7"/>
-        </w:numPr>
-        <w:rPr>
-          <w:rFonts w:cstheme="minorHAnsi"/>
-          <w:sz w:val="24"/>
-          <w:szCs w:val="24"/>
-        </w:rPr>
-      </w:pPr>
-      <w:r>
-        <w:rPr>
-          <w:rFonts w:cstheme="minorHAnsi"/>
-          <w:sz w:val="24"/>
-          <w:szCs w:val="24"/>
-        </w:rPr>
-        <w:t>Lazy loading</w:t>
-      </w:r>
-    </w:p>
-    <w:p>
-      <w:pPr>
-        <w:pStyle w:val="ListParagraph"/>
-        <w:numPr>
-          <w:ilvl w:val="0"/>
-          <w:numId w:val="7"/>
-        </w:numPr>
-        <w:rPr>
-          <w:rFonts w:cstheme="minorHAnsi"/>
-          <w:sz w:val="24"/>
-          <w:szCs w:val="24"/>
-        </w:rPr>
-      </w:pPr>
-      <w:r>
-        <w:rPr>
-          <w:rFonts w:cstheme="minorHAnsi"/>
-          <w:sz w:val="24"/>
-          <w:szCs w:val="24"/>
-        </w:rPr>
-        <w:t>Authentication</w:t>
-      </w:r>
     </w:p>
     <w:p>
       <w:pPr>

</xml_diff>

<commit_message>
updated README file content
</commit_message>
<xml_diff>
--- a/react-topics.docx
+++ b/react-topics.docx
@@ -18,7 +18,7 @@
           <w:sz w:val="24"/>
           <w:szCs w:val="24"/>
         </w:rPr>
-        <w:t>BASIC REACT CONCEPTS</w:t>
+        <w:t>REDUX TOOLKIT CONCEPTS</w:t>
       </w:r>
     </w:p>
     <w:p>
@@ -26,19 +26,19 @@
         <w:pStyle w:val="ListParagraph"/>
         <w:numPr>
           <w:ilvl w:val="0"/>
-          <w:numId w:val="1"/>
-        </w:numPr>
-        <w:rPr>
-          <w:sz w:val="24"/>
-          <w:szCs w:val="24"/>
-        </w:rPr>
-      </w:pPr>
-      <w:r>
-        <w:rPr>
-          <w:sz w:val="24"/>
-          <w:szCs w:val="24"/>
-        </w:rPr>
-        <w:t>Library vs. Framework</w:t>
+          <w:numId w:val="9"/>
+        </w:numPr>
+        <w:rPr>
+          <w:sz w:val="24"/>
+          <w:szCs w:val="24"/>
+        </w:rPr>
+      </w:pPr>
+      <w:r>
+        <w:rPr>
+          <w:sz w:val="24"/>
+          <w:szCs w:val="24"/>
+        </w:rPr>
+        <w:t>Shortcomings of core redux</w:t>
       </w:r>
     </w:p>
     <w:p>
@@ -46,19 +46,19 @@
         <w:pStyle w:val="ListParagraph"/>
         <w:numPr>
           <w:ilvl w:val="0"/>
-          <w:numId w:val="1"/>
-        </w:numPr>
-        <w:rPr>
-          <w:sz w:val="24"/>
-          <w:szCs w:val="24"/>
-        </w:rPr>
-      </w:pPr>
-      <w:r>
-        <w:rPr>
-          <w:sz w:val="24"/>
-          <w:szCs w:val="24"/>
-        </w:rPr>
-        <w:t>Why react is component-based architecture and what is meant by it?</w:t>
+          <w:numId w:val="9"/>
+        </w:numPr>
+        <w:rPr>
+          <w:sz w:val="24"/>
+          <w:szCs w:val="24"/>
+        </w:rPr>
+      </w:pPr>
+      <w:r>
+        <w:rPr>
+          <w:sz w:val="24"/>
+          <w:szCs w:val="24"/>
+        </w:rPr>
+        <w:t>What is redux toolkit? Why do we need it?</w:t>
       </w:r>
     </w:p>
     <w:p>
@@ -66,19 +66,19 @@
         <w:pStyle w:val="ListParagraph"/>
         <w:numPr>
           <w:ilvl w:val="0"/>
-          <w:numId w:val="1"/>
-        </w:numPr>
-        <w:rPr>
-          <w:sz w:val="24"/>
-          <w:szCs w:val="24"/>
-        </w:rPr>
-      </w:pPr>
-      <w:r>
-        <w:rPr>
-          <w:sz w:val="24"/>
-          <w:szCs w:val="24"/>
-        </w:rPr>
-        <w:t>Whether react is declarative or imperative approach?</w:t>
+          <w:numId w:val="9"/>
+        </w:numPr>
+        <w:rPr>
+          <w:sz w:val="24"/>
+          <w:szCs w:val="24"/>
+        </w:rPr>
+      </w:pPr>
+      <w:r>
+        <w:rPr>
+          <w:sz w:val="24"/>
+          <w:szCs w:val="24"/>
+        </w:rPr>
+        <w:t>Async actions</w:t>
       </w:r>
     </w:p>
     <w:p>
@@ -86,1857 +86,39 @@
         <w:pStyle w:val="ListParagraph"/>
         <w:numPr>
           <w:ilvl w:val="0"/>
-          <w:numId w:val="1"/>
-        </w:numPr>
-        <w:rPr>
-          <w:sz w:val="24"/>
-          <w:szCs w:val="24"/>
-        </w:rPr>
-      </w:pPr>
-      <w:r>
-        <w:rPr>
-          <w:sz w:val="24"/>
-          <w:szCs w:val="24"/>
-        </w:rPr>
-        <w:t>What is declarative and imperative programming with examples?</w:t>
-      </w:r>
-    </w:p>
-    <w:p>
-      <w:pPr>
-        <w:pStyle w:val="ListParagraph"/>
-        <w:numPr>
-          <w:ilvl w:val="0"/>
-          <w:numId w:val="1"/>
-        </w:numPr>
-        <w:rPr>
-          <w:sz w:val="24"/>
-          <w:szCs w:val="24"/>
-        </w:rPr>
-      </w:pPr>
-      <w:r>
-        <w:rPr>
-          <w:sz w:val="24"/>
-          <w:szCs w:val="24"/>
-        </w:rPr>
-        <w:t>Advantages and disadvantages of declarative vs. imperative</w:t>
-      </w:r>
-    </w:p>
-    <w:p>
-      <w:pPr>
-        <w:pStyle w:val="ListParagraph"/>
-        <w:numPr>
-          <w:ilvl w:val="0"/>
-          <w:numId w:val="1"/>
-        </w:numPr>
-        <w:rPr>
-          <w:sz w:val="24"/>
-          <w:szCs w:val="24"/>
-        </w:rPr>
-      </w:pPr>
-      <w:r>
-        <w:rPr>
-          <w:sz w:val="24"/>
-          <w:szCs w:val="24"/>
-        </w:rPr>
-        <w:t>What is virtual DOM?</w:t>
-      </w:r>
-    </w:p>
-    <w:p>
-      <w:pPr>
-        <w:pStyle w:val="ListParagraph"/>
-        <w:numPr>
-          <w:ilvl w:val="0"/>
-          <w:numId w:val="1"/>
-        </w:numPr>
-        <w:rPr>
-          <w:sz w:val="24"/>
-          <w:szCs w:val="24"/>
-        </w:rPr>
-      </w:pPr>
-      <w:r>
-        <w:rPr>
-          <w:sz w:val="24"/>
-          <w:szCs w:val="24"/>
-        </w:rPr>
-        <w:t>What is Babel?</w:t>
-      </w:r>
-    </w:p>
-    <w:p>
-      <w:pPr>
-        <w:pStyle w:val="ListParagraph"/>
-        <w:numPr>
-          <w:ilvl w:val="0"/>
-          <w:numId w:val="1"/>
-        </w:numPr>
-        <w:rPr>
-          <w:sz w:val="24"/>
-          <w:szCs w:val="24"/>
-        </w:rPr>
-      </w:pPr>
-      <w:r>
-        <w:rPr>
-          <w:sz w:val="24"/>
-          <w:szCs w:val="24"/>
-        </w:rPr>
-        <w:t>What is component?</w:t>
-      </w:r>
-    </w:p>
-    <w:p>
-      <w:pPr>
-        <w:pStyle w:val="ListParagraph"/>
-        <w:numPr>
-          <w:ilvl w:val="0"/>
-          <w:numId w:val="1"/>
-        </w:numPr>
-        <w:rPr>
-          <w:sz w:val="24"/>
-          <w:szCs w:val="24"/>
-        </w:rPr>
-      </w:pPr>
-      <w:r>
-        <w:rPr>
-          <w:sz w:val="24"/>
-          <w:szCs w:val="24"/>
-        </w:rPr>
-        <w:t>Types of components</w:t>
-      </w:r>
-    </w:p>
-    <w:p>
-      <w:pPr>
-        <w:pStyle w:val="ListParagraph"/>
-        <w:numPr>
-          <w:ilvl w:val="0"/>
-          <w:numId w:val="1"/>
-        </w:numPr>
-        <w:rPr>
-          <w:sz w:val="24"/>
-          <w:szCs w:val="24"/>
-        </w:rPr>
-      </w:pPr>
-      <w:r>
-        <w:rPr>
-          <w:sz w:val="24"/>
-          <w:szCs w:val="24"/>
-        </w:rPr>
-        <w:t>Comparison of Functional vs. Class Components</w:t>
-      </w:r>
-    </w:p>
-    <w:p>
-      <w:pPr>
-        <w:pStyle w:val="ListParagraph"/>
-        <w:numPr>
-          <w:ilvl w:val="0"/>
-          <w:numId w:val="1"/>
-        </w:numPr>
-        <w:rPr>
-          <w:sz w:val="24"/>
-          <w:szCs w:val="24"/>
-        </w:rPr>
-      </w:pPr>
-      <w:r>
-        <w:rPr>
-          <w:sz w:val="24"/>
-          <w:szCs w:val="24"/>
-        </w:rPr>
-        <w:t>What are reusable components?</w:t>
-      </w:r>
-    </w:p>
-    <w:p>
-      <w:pPr>
-        <w:pStyle w:val="ListParagraph"/>
-        <w:numPr>
-          <w:ilvl w:val="0"/>
-          <w:numId w:val="1"/>
-        </w:numPr>
-        <w:rPr>
-          <w:sz w:val="24"/>
-          <w:szCs w:val="24"/>
-        </w:rPr>
-      </w:pPr>
-      <w:r>
-        <w:rPr>
-          <w:sz w:val="24"/>
-          <w:szCs w:val="24"/>
-        </w:rPr>
-        <w:t xml:space="preserve">Two ways of </w:t>
-      </w:r>
-      <w:r>
-        <w:rPr>
-          <w:sz w:val="24"/>
-          <w:szCs w:val="24"/>
-        </w:rPr>
-        <w:t xml:space="preserve">exporting and </w:t>
-      </w:r>
-      <w:r>
-        <w:rPr>
-          <w:sz w:val="24"/>
-          <w:szCs w:val="24"/>
-        </w:rPr>
-        <w:t>importing components</w:t>
-      </w:r>
-    </w:p>
-    <w:p>
-      <w:pPr>
-        <w:pStyle w:val="ListParagraph"/>
-        <w:numPr>
-          <w:ilvl w:val="0"/>
-          <w:numId w:val="1"/>
-        </w:numPr>
-        <w:rPr>
-          <w:sz w:val="24"/>
-          <w:szCs w:val="24"/>
-        </w:rPr>
-      </w:pPr>
-      <w:r>
-        <w:rPr>
-          <w:sz w:val="24"/>
-          <w:szCs w:val="24"/>
-        </w:rPr>
-        <w:t>What is JSX?</w:t>
-      </w:r>
-    </w:p>
-    <w:p>
-      <w:pPr>
-        <w:pStyle w:val="ListParagraph"/>
-        <w:numPr>
-          <w:ilvl w:val="0"/>
-          <w:numId w:val="1"/>
-        </w:numPr>
-        <w:rPr>
-          <w:sz w:val="24"/>
-          <w:szCs w:val="24"/>
-        </w:rPr>
-      </w:pPr>
-      <w:r>
-        <w:rPr>
-          <w:sz w:val="24"/>
-          <w:szCs w:val="24"/>
-        </w:rPr>
-        <w:t>How</w:t>
-      </w:r>
-      <w:r>
-        <w:rPr>
-          <w:sz w:val="24"/>
-          <w:szCs w:val="24"/>
-        </w:rPr>
-        <w:t xml:space="preserve"> to create a basic functional </w:t>
-      </w:r>
-      <w:r>
-        <w:rPr>
-          <w:sz w:val="24"/>
-          <w:szCs w:val="24"/>
-        </w:rPr>
-        <w:t>and class component</w:t>
-      </w:r>
-    </w:p>
-    <w:p>
-      <w:pPr>
-        <w:pStyle w:val="ListParagraph"/>
-        <w:numPr>
-          <w:ilvl w:val="1"/>
-          <w:numId w:val="1"/>
-        </w:numPr>
-        <w:rPr>
-          <w:sz w:val="24"/>
-          <w:szCs w:val="24"/>
-        </w:rPr>
-      </w:pPr>
-      <w:r>
-        <w:rPr>
-          <w:sz w:val="24"/>
-          <w:szCs w:val="24"/>
-        </w:rPr>
-        <w:t>How to create variables in class component?</w:t>
-      </w:r>
-    </w:p>
-    <w:p>
-      <w:pPr>
-        <w:pStyle w:val="ListParagraph"/>
-        <w:numPr>
-          <w:ilvl w:val="1"/>
-          <w:numId w:val="1"/>
-        </w:numPr>
-        <w:rPr>
-          <w:sz w:val="24"/>
-          <w:szCs w:val="24"/>
-        </w:rPr>
-      </w:pPr>
-      <w:r>
-        <w:rPr>
-          <w:sz w:val="24"/>
-          <w:szCs w:val="24"/>
-        </w:rPr>
-        <w:t xml:space="preserve">Could </w:t>
-      </w:r>
-      <w:r>
-        <w:rPr>
-          <w:sz w:val="24"/>
-          <w:szCs w:val="24"/>
-        </w:rPr>
-        <w:t>we pass class</w:t>
-      </w:r>
-      <w:r>
-        <w:rPr>
-          <w:sz w:val="24"/>
-          <w:szCs w:val="24"/>
-        </w:rPr>
-        <w:t xml:space="preserve"> </w:t>
-      </w:r>
-      <w:r>
-        <w:rPr>
-          <w:sz w:val="24"/>
-          <w:szCs w:val="24"/>
-        </w:rPr>
-        <w:t>states</w:t>
-      </w:r>
-      <w:r>
-        <w:rPr>
-          <w:sz w:val="24"/>
-          <w:szCs w:val="24"/>
-        </w:rPr>
-        <w:t xml:space="preserve"> </w:t>
-      </w:r>
-      <w:r>
-        <w:rPr>
-          <w:sz w:val="24"/>
-          <w:szCs w:val="24"/>
-        </w:rPr>
-        <w:t>as a prop to another component?</w:t>
-      </w:r>
-    </w:p>
-    <w:p>
-      <w:pPr>
-        <w:pStyle w:val="ListParagraph"/>
-        <w:numPr>
-          <w:ilvl w:val="1"/>
-          <w:numId w:val="1"/>
-        </w:numPr>
-        <w:rPr>
-          <w:sz w:val="24"/>
-          <w:szCs w:val="24"/>
-        </w:rPr>
-      </w:pPr>
-      <w:r>
-        <w:rPr>
-          <w:sz w:val="24"/>
-          <w:szCs w:val="24"/>
-        </w:rPr>
-        <w:t>Creating two component using inheritance within the same component</w:t>
-      </w:r>
-    </w:p>
-    <w:p>
-      <w:pPr>
-        <w:pStyle w:val="ListParagraph"/>
-        <w:numPr>
-          <w:ilvl w:val="0"/>
-          <w:numId w:val="1"/>
-        </w:numPr>
-        <w:rPr>
-          <w:sz w:val="24"/>
-          <w:szCs w:val="24"/>
-        </w:rPr>
-      </w:pPr>
-      <w:r>
-        <w:rPr>
-          <w:sz w:val="24"/>
-          <w:szCs w:val="24"/>
-        </w:rPr>
-        <w:t>Props</w:t>
-      </w:r>
-    </w:p>
-    <w:p>
-      <w:pPr>
-        <w:pStyle w:val="ListParagraph"/>
-        <w:numPr>
-          <w:ilvl w:val="1"/>
-          <w:numId w:val="1"/>
-        </w:numPr>
-        <w:rPr>
-          <w:sz w:val="24"/>
-          <w:szCs w:val="24"/>
-        </w:rPr>
-      </w:pPr>
-      <w:r>
-        <w:rPr>
-          <w:sz w:val="24"/>
-          <w:szCs w:val="24"/>
-        </w:rPr>
-        <w:t>Props w/ functional component</w:t>
-      </w:r>
-      <w:r>
-        <w:rPr>
-          <w:sz w:val="24"/>
-          <w:szCs w:val="24"/>
-        </w:rPr>
-        <w:t xml:space="preserve"> and class component</w:t>
-      </w:r>
-    </w:p>
-    <w:p>
-      <w:pPr>
-        <w:pStyle w:val="ListParagraph"/>
-        <w:numPr>
-          <w:ilvl w:val="1"/>
-          <w:numId w:val="1"/>
-        </w:numPr>
-        <w:rPr>
-          <w:sz w:val="24"/>
-          <w:szCs w:val="24"/>
-        </w:rPr>
-      </w:pPr>
-      <w:r>
-        <w:rPr>
-          <w:sz w:val="24"/>
-          <w:szCs w:val="24"/>
-        </w:rPr>
-        <w:t>Children props w/ functional component</w:t>
-      </w:r>
-      <w:r>
-        <w:rPr>
-          <w:sz w:val="24"/>
-          <w:szCs w:val="24"/>
-        </w:rPr>
-        <w:t xml:space="preserve"> and </w:t>
-      </w:r>
-      <w:r>
-        <w:rPr>
-          <w:sz w:val="24"/>
-          <w:szCs w:val="24"/>
-        </w:rPr>
-        <w:t>class component</w:t>
-      </w:r>
-    </w:p>
-    <w:p>
-      <w:pPr>
-        <w:pStyle w:val="ListParagraph"/>
-        <w:numPr>
-          <w:ilvl w:val="1"/>
-          <w:numId w:val="1"/>
-        </w:numPr>
-        <w:rPr>
-          <w:sz w:val="24"/>
-          <w:szCs w:val="24"/>
-        </w:rPr>
-      </w:pPr>
-      <w:r>
-        <w:rPr>
-          <w:sz w:val="24"/>
-          <w:szCs w:val="24"/>
-        </w:rPr>
-        <w:t xml:space="preserve">Let’s say you have a list of props defined in your components. You have passed one of them to a component and </w:t>
-      </w:r>
-      <w:r>
-        <w:rPr>
-          <w:sz w:val="24"/>
-          <w:szCs w:val="24"/>
-        </w:rPr>
-        <w:t>how to send the remaining props now at once?</w:t>
-      </w:r>
-    </w:p>
-    <w:p>
-      <w:pPr>
-        <w:pStyle w:val="ListParagraph"/>
-        <w:numPr>
-          <w:ilvl w:val="1"/>
-          <w:numId w:val="1"/>
-        </w:numPr>
-        <w:rPr>
-          <w:sz w:val="24"/>
-          <w:szCs w:val="24"/>
-        </w:rPr>
-      </w:pPr>
-      <w:r>
-        <w:rPr>
-          <w:sz w:val="24"/>
-          <w:szCs w:val="24"/>
-        </w:rPr>
-        <w:t>Passing a prop to a parent component from child component.</w:t>
-      </w:r>
-    </w:p>
-    <w:p>
-      <w:pPr>
-        <w:pStyle w:val="ListParagraph"/>
-        <w:numPr>
-          <w:ilvl w:val="0"/>
-          <w:numId w:val="1"/>
-        </w:numPr>
-        <w:rPr>
-          <w:sz w:val="24"/>
-          <w:szCs w:val="24"/>
-        </w:rPr>
-      </w:pPr>
-      <w:r>
-        <w:rPr>
-          <w:sz w:val="24"/>
-          <w:szCs w:val="24"/>
-        </w:rPr>
-        <w:t>State</w:t>
-      </w:r>
-    </w:p>
-    <w:p>
-      <w:pPr>
-        <w:pStyle w:val="ListParagraph"/>
-        <w:numPr>
-          <w:ilvl w:val="1"/>
-          <w:numId w:val="1"/>
-        </w:numPr>
-        <w:rPr>
-          <w:sz w:val="24"/>
-          <w:szCs w:val="24"/>
-        </w:rPr>
-      </w:pPr>
-      <w:r>
-        <w:rPr>
-          <w:sz w:val="24"/>
-          <w:szCs w:val="24"/>
-        </w:rPr>
-        <w:t>Comparison of</w:t>
-      </w:r>
-      <w:r>
-        <w:rPr>
-          <w:sz w:val="24"/>
-          <w:szCs w:val="24"/>
-        </w:rPr>
-        <w:t xml:space="preserve"> state and props</w:t>
-      </w:r>
-    </w:p>
-    <w:p>
-      <w:pPr>
-        <w:pStyle w:val="ListParagraph"/>
-        <w:numPr>
-          <w:ilvl w:val="1"/>
-          <w:numId w:val="1"/>
-        </w:numPr>
-        <w:rPr>
-          <w:sz w:val="24"/>
-          <w:szCs w:val="24"/>
-        </w:rPr>
-      </w:pPr>
-      <w:r>
-        <w:rPr>
-          <w:sz w:val="24"/>
-          <w:szCs w:val="24"/>
-        </w:rPr>
-        <w:t xml:space="preserve">State w/ </w:t>
-      </w:r>
-      <w:r>
-        <w:rPr>
-          <w:sz w:val="24"/>
-          <w:szCs w:val="24"/>
-        </w:rPr>
-        <w:t>class component</w:t>
-      </w:r>
-    </w:p>
-    <w:p>
-      <w:pPr>
-        <w:pStyle w:val="ListParagraph"/>
-        <w:numPr>
-          <w:ilvl w:val="1"/>
-          <w:numId w:val="1"/>
-        </w:numPr>
-        <w:rPr>
-          <w:sz w:val="24"/>
-          <w:szCs w:val="24"/>
-        </w:rPr>
-      </w:pPr>
-      <w:r>
-        <w:rPr>
-          <w:sz w:val="24"/>
-          <w:szCs w:val="24"/>
-        </w:rPr>
-        <w:t>setState () method</w:t>
-      </w:r>
-    </w:p>
-    <w:p>
-      <w:pPr>
-        <w:pStyle w:val="ListParagraph"/>
-        <w:numPr>
-          <w:ilvl w:val="1"/>
-          <w:numId w:val="1"/>
-        </w:numPr>
-        <w:rPr>
-          <w:sz w:val="24"/>
-          <w:szCs w:val="24"/>
-        </w:rPr>
-      </w:pPr>
-      <w:r>
-        <w:rPr>
-          <w:sz w:val="24"/>
-          <w:szCs w:val="24"/>
-        </w:rPr>
-        <w:t xml:space="preserve">Destructuring </w:t>
-      </w:r>
-      <w:r>
-        <w:rPr>
-          <w:sz w:val="24"/>
-          <w:szCs w:val="24"/>
-        </w:rPr>
-        <w:t>p</w:t>
-      </w:r>
-      <w:r>
-        <w:rPr>
-          <w:sz w:val="24"/>
-          <w:szCs w:val="24"/>
-        </w:rPr>
-        <w:t xml:space="preserve">rops and </w:t>
-      </w:r>
-      <w:r>
-        <w:rPr>
-          <w:sz w:val="24"/>
-          <w:szCs w:val="24"/>
-        </w:rPr>
-        <w:t>s</w:t>
-      </w:r>
-      <w:r>
-        <w:rPr>
-          <w:sz w:val="24"/>
-          <w:szCs w:val="24"/>
-        </w:rPr>
-        <w:t>tate</w:t>
-      </w:r>
-    </w:p>
-    <w:p>
-      <w:pPr>
-        <w:pStyle w:val="ListParagraph"/>
-        <w:numPr>
-          <w:ilvl w:val="1"/>
-          <w:numId w:val="1"/>
-        </w:numPr>
-        <w:rPr>
-          <w:sz w:val="24"/>
-          <w:szCs w:val="24"/>
-        </w:rPr>
-      </w:pPr>
-      <w:r>
-        <w:rPr>
-          <w:sz w:val="24"/>
-          <w:szCs w:val="24"/>
-        </w:rPr>
-        <w:t>Destructuring w/ default values</w:t>
-      </w:r>
-    </w:p>
-    <w:p>
-      <w:pPr>
-        <w:pStyle w:val="ListParagraph"/>
-        <w:numPr>
-          <w:ilvl w:val="1"/>
-          <w:numId w:val="1"/>
-        </w:numPr>
-        <w:rPr>
-          <w:sz w:val="24"/>
-          <w:szCs w:val="24"/>
-        </w:rPr>
-      </w:pPr>
-      <w:r>
-        <w:rPr>
-          <w:sz w:val="24"/>
-          <w:szCs w:val="24"/>
-        </w:rPr>
-        <w:t>State defining outside constructor</w:t>
-      </w:r>
-    </w:p>
-    <w:p>
-      <w:pPr>
-        <w:pStyle w:val="ListParagraph"/>
-        <w:numPr>
-          <w:ilvl w:val="0"/>
-          <w:numId w:val="1"/>
-        </w:numPr>
-        <w:rPr>
-          <w:sz w:val="24"/>
-          <w:szCs w:val="24"/>
-        </w:rPr>
-      </w:pPr>
-      <w:r>
-        <w:rPr>
-          <w:sz w:val="24"/>
-          <w:szCs w:val="24"/>
-        </w:rPr>
-        <w:t>Event Handling</w:t>
-      </w:r>
-      <w:r>
-        <w:rPr>
-          <w:sz w:val="24"/>
-          <w:szCs w:val="24"/>
-        </w:rPr>
-        <w:t xml:space="preserve"> – Binding </w:t>
-      </w:r>
-      <w:r>
-        <w:rPr>
-          <w:sz w:val="24"/>
-          <w:szCs w:val="24"/>
-        </w:rPr>
-        <w:t xml:space="preserve">event handlers </w:t>
-      </w:r>
-      <w:r>
-        <w:rPr>
-          <w:sz w:val="24"/>
-          <w:szCs w:val="24"/>
-        </w:rPr>
-        <w:t xml:space="preserve">in </w:t>
-      </w:r>
-      <w:r>
-        <w:rPr>
-          <w:sz w:val="24"/>
-          <w:szCs w:val="24"/>
-        </w:rPr>
-        <w:t>four</w:t>
-      </w:r>
-      <w:r>
-        <w:rPr>
-          <w:sz w:val="24"/>
-          <w:szCs w:val="24"/>
-        </w:rPr>
-        <w:t xml:space="preserve"> ways</w:t>
-      </w:r>
-    </w:p>
-    <w:p>
-      <w:pPr>
-        <w:pStyle w:val="ListParagraph"/>
-        <w:numPr>
-          <w:ilvl w:val="0"/>
-          <w:numId w:val="1"/>
-        </w:numPr>
-        <w:rPr>
-          <w:sz w:val="24"/>
-          <w:szCs w:val="24"/>
-        </w:rPr>
-      </w:pPr>
-      <w:r>
-        <w:rPr>
-          <w:sz w:val="24"/>
-          <w:szCs w:val="24"/>
-        </w:rPr>
-        <w:t>Conditional Rendering</w:t>
-      </w:r>
-    </w:p>
-    <w:p>
-      <w:pPr>
-        <w:pStyle w:val="ListParagraph"/>
-        <w:numPr>
-          <w:ilvl w:val="0"/>
-          <w:numId w:val="1"/>
-        </w:numPr>
-        <w:rPr>
-          <w:sz w:val="24"/>
-          <w:szCs w:val="24"/>
-        </w:rPr>
-      </w:pPr>
-      <w:r>
-        <w:rPr>
-          <w:sz w:val="24"/>
-          <w:szCs w:val="24"/>
-        </w:rPr>
-        <w:t>List Rendering</w:t>
-      </w:r>
-    </w:p>
-    <w:p>
-      <w:pPr>
-        <w:pStyle w:val="ListParagraph"/>
-        <w:numPr>
-          <w:ilvl w:val="1"/>
-          <w:numId w:val="1"/>
-        </w:numPr>
-        <w:rPr>
-          <w:sz w:val="24"/>
-          <w:szCs w:val="24"/>
-        </w:rPr>
-      </w:pPr>
-      <w:r>
-        <w:rPr>
-          <w:sz w:val="24"/>
-          <w:szCs w:val="24"/>
-        </w:rPr>
-        <w:t>List and key</w:t>
-      </w:r>
-      <w:r>
-        <w:rPr>
-          <w:sz w:val="24"/>
-          <w:szCs w:val="24"/>
-        </w:rPr>
-        <w:t xml:space="preserve"> attribute</w:t>
-      </w:r>
-    </w:p>
-    <w:p>
-      <w:pPr>
-        <w:pStyle w:val="ListParagraph"/>
-        <w:numPr>
-          <w:ilvl w:val="1"/>
-          <w:numId w:val="1"/>
-        </w:numPr>
-        <w:rPr>
-          <w:sz w:val="24"/>
-          <w:szCs w:val="24"/>
-        </w:rPr>
-      </w:pPr>
-      <w:r>
-        <w:rPr>
-          <w:sz w:val="24"/>
-          <w:szCs w:val="24"/>
-        </w:rPr>
-        <w:t>Can we access key while rendering lists? – No, key is used to render list more efficiently.</w:t>
-      </w:r>
-      <w:r>
-        <w:rPr>
-          <w:sz w:val="24"/>
-          <w:szCs w:val="24"/>
-        </w:rPr>
-        <w:t xml:space="preserve"> Key is a reserved </w:t>
-      </w:r>
-      <w:r>
-        <w:rPr>
-          <w:sz w:val="24"/>
-          <w:szCs w:val="24"/>
-        </w:rPr>
-        <w:t>keyword;</w:t>
-      </w:r>
-      <w:r>
-        <w:rPr>
-          <w:sz w:val="24"/>
-          <w:szCs w:val="24"/>
-        </w:rPr>
-        <w:t xml:space="preserve"> we cannot use as any other </w:t>
-      </w:r>
-      <w:r>
-        <w:rPr>
-          <w:sz w:val="24"/>
-          <w:szCs w:val="24"/>
-        </w:rPr>
-        <w:t>props</w:t>
-      </w:r>
-      <w:r>
-        <w:rPr>
-          <w:sz w:val="24"/>
-          <w:szCs w:val="24"/>
-        </w:rPr>
-        <w:t xml:space="preserve"> </w:t>
-      </w:r>
-      <w:r>
-        <w:rPr>
-          <w:sz w:val="24"/>
-          <w:szCs w:val="24"/>
-        </w:rPr>
-        <w:t xml:space="preserve">as key with the same name </w:t>
-      </w:r>
-      <w:r>
-        <w:rPr>
-          <w:sz w:val="24"/>
-          <w:szCs w:val="24"/>
-        </w:rPr>
-        <w:t xml:space="preserve">to </w:t>
-      </w:r>
-      <w:r>
-        <w:rPr>
-          <w:sz w:val="24"/>
-          <w:szCs w:val="24"/>
-        </w:rPr>
-        <w:t xml:space="preserve">pass </w:t>
-      </w:r>
-      <w:r>
-        <w:rPr>
-          <w:sz w:val="24"/>
-          <w:szCs w:val="24"/>
-        </w:rPr>
-        <w:t>data</w:t>
-      </w:r>
-      <w:r>
-        <w:rPr>
-          <w:sz w:val="24"/>
-          <w:szCs w:val="24"/>
-        </w:rPr>
-        <w:t xml:space="preserve"> </w:t>
-      </w:r>
-      <w:r>
-        <w:rPr>
-          <w:sz w:val="24"/>
-          <w:szCs w:val="24"/>
-        </w:rPr>
-        <w:t>between</w:t>
-      </w:r>
-      <w:r>
-        <w:rPr>
-          <w:sz w:val="24"/>
-          <w:szCs w:val="24"/>
-        </w:rPr>
-        <w:t xml:space="preserve"> components.</w:t>
-      </w:r>
-    </w:p>
-    <w:p>
-      <w:pPr>
-        <w:pStyle w:val="ListParagraph"/>
-        <w:numPr>
-          <w:ilvl w:val="1"/>
-          <w:numId w:val="1"/>
-        </w:numPr>
-        <w:rPr>
-          <w:sz w:val="24"/>
-          <w:szCs w:val="24"/>
-        </w:rPr>
-      </w:pPr>
-      <w:r>
-        <w:rPr>
-          <w:sz w:val="24"/>
-          <w:szCs w:val="24"/>
-        </w:rPr>
-        <w:t xml:space="preserve">Index as a key anti-pattern </w:t>
-      </w:r>
-      <w:r>
-        <w:rPr>
-          <w:sz w:val="24"/>
-          <w:szCs w:val="24"/>
-        </w:rPr>
-        <w:t>and also problem with index as a key – elaborate.</w:t>
-      </w:r>
-    </w:p>
-    <w:p>
-      <w:pPr>
-        <w:pStyle w:val="ListParagraph"/>
-        <w:numPr>
-          <w:ilvl w:val="0"/>
-          <w:numId w:val="1"/>
-        </w:numPr>
-        <w:rPr>
-          <w:sz w:val="24"/>
-          <w:szCs w:val="24"/>
-        </w:rPr>
-      </w:pPr>
-      <w:r>
-        <w:rPr>
-          <w:sz w:val="24"/>
-          <w:szCs w:val="24"/>
-        </w:rPr>
-        <w:t>CSS styles in React</w:t>
-      </w:r>
-    </w:p>
-    <w:p>
-      <w:pPr>
-        <w:pStyle w:val="ListParagraph"/>
-        <w:numPr>
-          <w:ilvl w:val="0"/>
-          <w:numId w:val="1"/>
-        </w:numPr>
-        <w:rPr>
-          <w:sz w:val="24"/>
-          <w:szCs w:val="24"/>
-        </w:rPr>
-      </w:pPr>
-      <w:r>
-        <w:rPr>
-          <w:sz w:val="24"/>
-          <w:szCs w:val="24"/>
-        </w:rPr>
-        <w:t>Basic Form handling</w:t>
-      </w:r>
-    </w:p>
-    <w:p>
-      <w:pPr>
-        <w:pStyle w:val="ListParagraph"/>
-        <w:numPr>
-          <w:ilvl w:val="0"/>
-          <w:numId w:val="1"/>
-        </w:numPr>
-        <w:rPr>
-          <w:sz w:val="24"/>
-          <w:szCs w:val="24"/>
-        </w:rPr>
-      </w:pPr>
-      <w:r>
-        <w:rPr>
-          <w:sz w:val="24"/>
-          <w:szCs w:val="24"/>
-        </w:rPr>
-        <w:t>Lazy Components</w:t>
-      </w:r>
-    </w:p>
-    <w:p>
-      <w:pPr>
-        <w:pStyle w:val="ListParagraph"/>
-        <w:numPr>
-          <w:ilvl w:val="0"/>
-          <w:numId w:val="1"/>
-        </w:numPr>
-        <w:rPr>
-          <w:sz w:val="24"/>
-          <w:szCs w:val="24"/>
-        </w:rPr>
-      </w:pPr>
-      <w:r>
-        <w:rPr>
-          <w:sz w:val="24"/>
-          <w:szCs w:val="24"/>
-        </w:rPr>
-        <w:lastRenderedPageBreak/>
-        <w:t>Controlled Components vs. Uncontrolled components</w:t>
-      </w:r>
-    </w:p>
-    <w:p>
-      <w:pPr>
-        <w:pStyle w:val="ListParagraph"/>
-        <w:numPr>
-          <w:ilvl w:val="0"/>
-          <w:numId w:val="1"/>
-        </w:numPr>
-        <w:rPr>
-          <w:sz w:val="24"/>
-          <w:szCs w:val="24"/>
-        </w:rPr>
-      </w:pPr>
-      <w:r>
-        <w:rPr>
-          <w:sz w:val="24"/>
-          <w:szCs w:val="24"/>
-        </w:rPr>
-        <w:t xml:space="preserve">Components Lifecycle </w:t>
-      </w:r>
-      <w:r>
-        <w:rPr>
-          <w:sz w:val="24"/>
-          <w:szCs w:val="24"/>
-        </w:rPr>
-        <w:t>stages</w:t>
-      </w:r>
-    </w:p>
-    <w:p>
-      <w:pPr>
-        <w:pStyle w:val="ListParagraph"/>
-        <w:numPr>
-          <w:ilvl w:val="1"/>
-          <w:numId w:val="1"/>
-        </w:numPr>
-        <w:rPr>
-          <w:sz w:val="24"/>
-          <w:szCs w:val="24"/>
-        </w:rPr>
-      </w:pPr>
-      <w:r>
-        <w:rPr>
-          <w:sz w:val="24"/>
-          <w:szCs w:val="24"/>
-        </w:rPr>
-        <w:t xml:space="preserve">Mounting </w:t>
-      </w:r>
-      <w:r>
-        <w:rPr>
-          <w:sz w:val="24"/>
-          <w:szCs w:val="24"/>
-        </w:rPr>
-        <w:t>Phase</w:t>
-      </w:r>
-    </w:p>
-    <w:p>
-      <w:pPr>
-        <w:pStyle w:val="ListParagraph"/>
-        <w:numPr>
-          <w:ilvl w:val="2"/>
-          <w:numId w:val="1"/>
-        </w:numPr>
-        <w:rPr>
-          <w:sz w:val="24"/>
-          <w:szCs w:val="24"/>
-        </w:rPr>
-      </w:pPr>
-      <w:r>
-        <w:rPr>
-          <w:sz w:val="24"/>
-          <w:szCs w:val="24"/>
-        </w:rPr>
-        <w:t>Why getDerivedStateFromProps method does not have access to this keyword?</w:t>
-      </w:r>
-    </w:p>
-    <w:p>
-      <w:pPr>
-        <w:pStyle w:val="ListParagraph"/>
-        <w:numPr>
-          <w:ilvl w:val="1"/>
-          <w:numId w:val="1"/>
-        </w:numPr>
-        <w:rPr>
-          <w:sz w:val="24"/>
-          <w:szCs w:val="24"/>
-        </w:rPr>
-      </w:pPr>
-      <w:r>
-        <w:rPr>
-          <w:sz w:val="24"/>
-          <w:szCs w:val="24"/>
-        </w:rPr>
-        <w:t xml:space="preserve">Updating </w:t>
-      </w:r>
-      <w:r>
-        <w:rPr>
-          <w:sz w:val="24"/>
-          <w:szCs w:val="24"/>
-        </w:rPr>
-        <w:t>Phase</w:t>
-      </w:r>
-    </w:p>
-    <w:p>
-      <w:pPr>
-        <w:pStyle w:val="ListParagraph"/>
-        <w:numPr>
-          <w:ilvl w:val="1"/>
-          <w:numId w:val="1"/>
-        </w:numPr>
-        <w:rPr>
-          <w:sz w:val="24"/>
-          <w:szCs w:val="24"/>
-        </w:rPr>
-      </w:pPr>
-      <w:r>
-        <w:rPr>
-          <w:sz w:val="24"/>
-          <w:szCs w:val="24"/>
-        </w:rPr>
-        <w:t xml:space="preserve">Unmounting </w:t>
-      </w:r>
-      <w:r>
-        <w:rPr>
-          <w:sz w:val="24"/>
-          <w:szCs w:val="24"/>
-        </w:rPr>
-        <w:t>Phase</w:t>
-      </w:r>
-    </w:p>
-    <w:p>
-      <w:pPr>
-        <w:pStyle w:val="ListParagraph"/>
-        <w:numPr>
-          <w:ilvl w:val="1"/>
-          <w:numId w:val="1"/>
-        </w:numPr>
-        <w:rPr>
-          <w:sz w:val="24"/>
-          <w:szCs w:val="24"/>
-        </w:rPr>
-      </w:pPr>
-      <w:r>
-        <w:rPr>
-          <w:sz w:val="24"/>
-          <w:szCs w:val="24"/>
-        </w:rPr>
-        <w:t>Error Handling</w:t>
-      </w:r>
-      <w:r>
-        <w:rPr>
-          <w:sz w:val="24"/>
-          <w:szCs w:val="24"/>
-        </w:rPr>
-        <w:t xml:space="preserve"> Phase</w:t>
-      </w:r>
-    </w:p>
-    <w:p>
-      <w:pPr>
-        <w:pStyle w:val="ListParagraph"/>
-        <w:numPr>
-          <w:ilvl w:val="0"/>
-          <w:numId w:val="1"/>
-        </w:numPr>
-        <w:rPr>
-          <w:sz w:val="24"/>
-          <w:szCs w:val="24"/>
-        </w:rPr>
-      </w:pPr>
-      <w:r>
-        <w:rPr>
-          <w:sz w:val="24"/>
-          <w:szCs w:val="24"/>
-        </w:rPr>
-        <w:t>Pure components</w:t>
-      </w:r>
-    </w:p>
-    <w:p>
-      <w:pPr>
-        <w:pStyle w:val="ListParagraph"/>
-        <w:numPr>
-          <w:ilvl w:val="1"/>
-          <w:numId w:val="1"/>
-        </w:numPr>
-        <w:rPr>
-          <w:sz w:val="24"/>
-          <w:szCs w:val="24"/>
-        </w:rPr>
-      </w:pPr>
-      <w:r>
-        <w:rPr>
-          <w:sz w:val="24"/>
-          <w:szCs w:val="24"/>
-        </w:rPr>
-        <w:t>Difference between</w:t>
-      </w:r>
-      <w:r>
-        <w:rPr>
-          <w:sz w:val="24"/>
-          <w:szCs w:val="24"/>
-        </w:rPr>
-        <w:t xml:space="preserve"> </w:t>
-      </w:r>
-      <w:r>
-        <w:rPr>
-          <w:sz w:val="24"/>
-          <w:szCs w:val="24"/>
-        </w:rPr>
-        <w:t>r</w:t>
-      </w:r>
-      <w:r>
-        <w:rPr>
-          <w:sz w:val="24"/>
-          <w:szCs w:val="24"/>
-        </w:rPr>
-        <w:t xml:space="preserve">egular component and </w:t>
-      </w:r>
-      <w:r>
-        <w:rPr>
-          <w:sz w:val="24"/>
-          <w:szCs w:val="24"/>
-        </w:rPr>
-        <w:t>p</w:t>
-      </w:r>
-      <w:r>
-        <w:rPr>
-          <w:sz w:val="24"/>
-          <w:szCs w:val="24"/>
-        </w:rPr>
-        <w:t>ure component</w:t>
-      </w:r>
-    </w:p>
-    <w:p>
-      <w:pPr>
-        <w:pStyle w:val="ListParagraph"/>
-        <w:numPr>
-          <w:ilvl w:val="1"/>
-          <w:numId w:val="1"/>
-        </w:numPr>
-        <w:rPr>
-          <w:sz w:val="24"/>
-          <w:szCs w:val="24"/>
-        </w:rPr>
-      </w:pPr>
-      <w:r>
-        <w:rPr>
-          <w:sz w:val="24"/>
-          <w:szCs w:val="24"/>
-        </w:rPr>
-        <w:t>Pure components w</w:t>
-      </w:r>
-      <w:r>
-        <w:rPr>
-          <w:sz w:val="24"/>
-          <w:szCs w:val="24"/>
-        </w:rPr>
-        <w:t>ith</w:t>
-      </w:r>
-      <w:r>
-        <w:rPr>
-          <w:sz w:val="24"/>
-          <w:szCs w:val="24"/>
-        </w:rPr>
-        <w:t xml:space="preserve"> both </w:t>
-      </w:r>
-      <w:r>
-        <w:rPr>
-          <w:sz w:val="24"/>
-          <w:szCs w:val="24"/>
-        </w:rPr>
-        <w:t>class</w:t>
-      </w:r>
-      <w:r>
-        <w:rPr>
-          <w:sz w:val="24"/>
-          <w:szCs w:val="24"/>
-        </w:rPr>
-        <w:t xml:space="preserve"> and</w:t>
-      </w:r>
-      <w:r>
-        <w:rPr>
-          <w:sz w:val="24"/>
-          <w:szCs w:val="24"/>
-        </w:rPr>
-        <w:t xml:space="preserve"> </w:t>
-      </w:r>
-      <w:r>
-        <w:rPr>
-          <w:sz w:val="24"/>
-          <w:szCs w:val="24"/>
-        </w:rPr>
-        <w:t>functional</w:t>
-      </w:r>
-      <w:r>
-        <w:rPr>
-          <w:sz w:val="24"/>
-          <w:szCs w:val="24"/>
-        </w:rPr>
-        <w:t xml:space="preserve"> components</w:t>
-      </w:r>
-    </w:p>
-    <w:p>
-      <w:pPr>
-        <w:pStyle w:val="ListParagraph"/>
-        <w:numPr>
-          <w:ilvl w:val="1"/>
-          <w:numId w:val="1"/>
-        </w:numPr>
-        <w:rPr>
-          <w:sz w:val="24"/>
-          <w:szCs w:val="24"/>
-        </w:rPr>
-      </w:pPr>
-      <w:r>
-        <w:rPr>
-          <w:sz w:val="24"/>
-          <w:szCs w:val="24"/>
-        </w:rPr>
-        <w:t>Shallow comparison</w:t>
-      </w:r>
-      <w:r>
-        <w:rPr>
-          <w:sz w:val="24"/>
-          <w:szCs w:val="24"/>
-        </w:rPr>
-        <w:t xml:space="preserve"> w</w:t>
-      </w:r>
-      <w:r>
-        <w:rPr>
-          <w:sz w:val="24"/>
-          <w:szCs w:val="24"/>
-        </w:rPr>
-        <w:t>ith</w:t>
-      </w:r>
-      <w:r>
-        <w:rPr>
-          <w:sz w:val="24"/>
-          <w:szCs w:val="24"/>
-        </w:rPr>
-        <w:t xml:space="preserve"> primitive and complex types</w:t>
-      </w:r>
-      <w:r>
-        <w:rPr>
-          <w:sz w:val="24"/>
-          <w:szCs w:val="24"/>
-        </w:rPr>
-        <w:t xml:space="preserve"> and their implementation</w:t>
-      </w:r>
-    </w:p>
-    <w:p>
-      <w:pPr>
-        <w:pStyle w:val="ListParagraph"/>
-        <w:numPr>
-          <w:ilvl w:val="1"/>
-          <w:numId w:val="1"/>
-        </w:numPr>
-        <w:rPr>
-          <w:sz w:val="24"/>
-          <w:szCs w:val="24"/>
-        </w:rPr>
-      </w:pPr>
-      <w:r>
-        <w:rPr>
-          <w:sz w:val="24"/>
-          <w:szCs w:val="24"/>
-        </w:rPr>
-        <w:t>Need of pure components</w:t>
-      </w:r>
-    </w:p>
-    <w:p>
-      <w:pPr>
-        <w:pStyle w:val="ListParagraph"/>
-        <w:numPr>
-          <w:ilvl w:val="0"/>
-          <w:numId w:val="1"/>
-        </w:numPr>
-        <w:rPr>
-          <w:sz w:val="24"/>
-          <w:szCs w:val="24"/>
-        </w:rPr>
-      </w:pPr>
-      <w:r>
-        <w:rPr>
-          <w:sz w:val="24"/>
-          <w:szCs w:val="24"/>
-        </w:rPr>
-        <w:t>Refs – ways of creating refs</w:t>
-      </w:r>
-    </w:p>
-    <w:p>
-      <w:pPr>
-        <w:pStyle w:val="ListParagraph"/>
-        <w:numPr>
-          <w:ilvl w:val="0"/>
-          <w:numId w:val="1"/>
-        </w:numPr>
-        <w:rPr>
-          <w:sz w:val="24"/>
-          <w:szCs w:val="24"/>
-        </w:rPr>
-      </w:pPr>
-      <w:r>
-        <w:rPr>
-          <w:sz w:val="24"/>
-          <w:szCs w:val="24"/>
-        </w:rPr>
-        <w:t>React portal</w:t>
-      </w:r>
-    </w:p>
-    <w:p>
-      <w:pPr>
-        <w:pStyle w:val="ListParagraph"/>
-        <w:numPr>
-          <w:ilvl w:val="0"/>
-          <w:numId w:val="1"/>
-        </w:numPr>
-        <w:rPr>
-          <w:sz w:val="24"/>
-          <w:szCs w:val="24"/>
-        </w:rPr>
-      </w:pPr>
-      <w:r>
-        <w:rPr>
-          <w:sz w:val="24"/>
-          <w:szCs w:val="24"/>
-        </w:rPr>
-        <w:t>Higher Order Component</w:t>
-      </w:r>
-    </w:p>
-    <w:p>
-      <w:pPr>
-        <w:pStyle w:val="ListParagraph"/>
-        <w:numPr>
-          <w:ilvl w:val="1"/>
-          <w:numId w:val="1"/>
-        </w:numPr>
-        <w:rPr>
-          <w:sz w:val="24"/>
-          <w:szCs w:val="24"/>
-        </w:rPr>
-      </w:pPr>
-      <w:r>
-        <w:rPr>
-          <w:sz w:val="24"/>
-          <w:szCs w:val="24"/>
-        </w:rPr>
-        <w:t>Lifting the state</w:t>
-      </w:r>
-    </w:p>
-    <w:p>
-      <w:pPr>
-        <w:pStyle w:val="ListParagraph"/>
-        <w:numPr>
-          <w:ilvl w:val="1"/>
-          <w:numId w:val="1"/>
-        </w:numPr>
-        <w:rPr>
-          <w:sz w:val="24"/>
-          <w:szCs w:val="24"/>
-        </w:rPr>
-      </w:pPr>
-      <w:r>
-        <w:rPr>
-          <w:sz w:val="24"/>
-          <w:szCs w:val="24"/>
-        </w:rPr>
-        <w:t>Drilling down the props</w:t>
-      </w:r>
-    </w:p>
-    <w:p>
-      <w:pPr>
-        <w:pStyle w:val="ListParagraph"/>
-        <w:numPr>
-          <w:ilvl w:val="1"/>
-          <w:numId w:val="1"/>
-        </w:numPr>
-        <w:rPr>
-          <w:sz w:val="24"/>
-          <w:szCs w:val="24"/>
-        </w:rPr>
-      </w:pPr>
-      <w:r>
-        <w:rPr>
-          <w:sz w:val="24"/>
-          <w:szCs w:val="24"/>
-        </w:rPr>
-        <w:t>Application of higher order component</w:t>
-      </w:r>
-    </w:p>
-    <w:p>
-      <w:pPr>
-        <w:pStyle w:val="ListParagraph"/>
-        <w:numPr>
-          <w:ilvl w:val="0"/>
-          <w:numId w:val="1"/>
-        </w:numPr>
-        <w:rPr>
-          <w:sz w:val="24"/>
-          <w:szCs w:val="24"/>
-        </w:rPr>
-      </w:pPr>
-      <w:r>
-        <w:rPr>
-          <w:sz w:val="24"/>
-          <w:szCs w:val="24"/>
-        </w:rPr>
-        <w:t>Render Props</w:t>
-      </w:r>
-    </w:p>
-    <w:p>
-      <w:pPr>
-        <w:pStyle w:val="ListParagraph"/>
-        <w:numPr>
-          <w:ilvl w:val="1"/>
-          <w:numId w:val="1"/>
-        </w:numPr>
-        <w:rPr>
-          <w:sz w:val="24"/>
-          <w:szCs w:val="24"/>
-        </w:rPr>
-      </w:pPr>
-      <w:r>
-        <w:rPr>
-          <w:sz w:val="24"/>
-          <w:szCs w:val="24"/>
-          <w:lang w:val="en-US"/>
-        </w:rPr>
-        <w:t>Render props use cases</w:t>
-      </w:r>
-    </w:p>
-    <w:p>
-      <w:pPr>
-        <w:pStyle w:val="ListParagraph"/>
-        <w:numPr>
-          <w:ilvl w:val="1"/>
-          <w:numId w:val="1"/>
-        </w:numPr>
-        <w:rPr>
-          <w:sz w:val="24"/>
-          <w:szCs w:val="24"/>
-        </w:rPr>
-      </w:pPr>
-      <w:r>
-        <w:rPr>
-          <w:sz w:val="24"/>
-          <w:szCs w:val="24"/>
-          <w:lang w:val="en-US"/>
-        </w:rPr>
-        <w:t>Render</w:t>
-      </w:r>
-      <w:r>
-        <w:rPr>
-          <w:sz w:val="24"/>
-          <w:szCs w:val="24"/>
-          <w:lang w:val="en-US"/>
-        </w:rPr>
-        <w:t xml:space="preserve"> prop as an actual/children pro</w:t>
-      </w:r>
-      <w:r>
-        <w:rPr>
-          <w:sz w:val="24"/>
-          <w:szCs w:val="24"/>
-          <w:lang w:val="en-US"/>
-        </w:rPr>
-        <w:t>p</w:t>
-      </w:r>
-    </w:p>
-    <w:p>
-      <w:pPr>
-        <w:pStyle w:val="ListParagraph"/>
-        <w:numPr>
-          <w:ilvl w:val="0"/>
-          <w:numId w:val="1"/>
-        </w:numPr>
-        <w:rPr>
-          <w:sz w:val="24"/>
-          <w:szCs w:val="24"/>
-        </w:rPr>
-      </w:pPr>
-      <w:r>
-        <w:rPr>
-          <w:sz w:val="24"/>
-          <w:szCs w:val="24"/>
-        </w:rPr>
-        <w:t>Context API</w:t>
-      </w:r>
-    </w:p>
-    <w:p>
-      <w:pPr>
-        <w:pStyle w:val="ListParagraph"/>
-        <w:numPr>
-          <w:ilvl w:val="1"/>
-          <w:numId w:val="1"/>
-        </w:numPr>
-        <w:rPr>
-          <w:sz w:val="24"/>
-          <w:szCs w:val="24"/>
-        </w:rPr>
-      </w:pPr>
-      <w:r>
-        <w:rPr>
-          <w:sz w:val="24"/>
-          <w:szCs w:val="24"/>
-        </w:rPr>
-        <w:t>What is react context API and use case of it?</w:t>
-      </w:r>
-    </w:p>
-    <w:p>
-      <w:pPr>
-        <w:pStyle w:val="ListParagraph"/>
-        <w:numPr>
-          <w:ilvl w:val="1"/>
-          <w:numId w:val="1"/>
-        </w:numPr>
-        <w:rPr>
-          <w:sz w:val="24"/>
-          <w:szCs w:val="24"/>
-        </w:rPr>
-      </w:pPr>
-      <w:r>
-        <w:rPr>
-          <w:sz w:val="24"/>
-          <w:szCs w:val="24"/>
-        </w:rPr>
-        <w:t>Steps to create context</w:t>
-      </w:r>
-    </w:p>
-    <w:p>
-      <w:pPr>
-        <w:pStyle w:val="ListParagraph"/>
-        <w:numPr>
-          <w:ilvl w:val="1"/>
-          <w:numId w:val="1"/>
-        </w:numPr>
-        <w:rPr>
-          <w:sz w:val="24"/>
-          <w:szCs w:val="24"/>
-        </w:rPr>
-      </w:pPr>
-      <w:r>
-        <w:rPr>
-          <w:sz w:val="24"/>
-          <w:szCs w:val="24"/>
-        </w:rPr>
-        <w:t>How to set default values to the Context Provider?</w:t>
-      </w:r>
-    </w:p>
-    <w:p>
-      <w:pPr>
-        <w:pStyle w:val="ListParagraph"/>
-        <w:numPr>
-          <w:ilvl w:val="1"/>
-          <w:numId w:val="1"/>
-        </w:numPr>
-        <w:rPr>
-          <w:sz w:val="24"/>
-          <w:szCs w:val="24"/>
-        </w:rPr>
-      </w:pPr>
-      <w:r>
-        <w:rPr>
-          <w:sz w:val="24"/>
-          <w:szCs w:val="24"/>
-        </w:rPr>
-        <w:t>Three</w:t>
-      </w:r>
-      <w:r>
-        <w:rPr>
-          <w:sz w:val="24"/>
-          <w:szCs w:val="24"/>
-        </w:rPr>
-        <w:t xml:space="preserve"> </w:t>
-      </w:r>
-      <w:r>
-        <w:rPr>
-          <w:sz w:val="24"/>
-          <w:szCs w:val="24"/>
-        </w:rPr>
-        <w:t>ways</w:t>
-      </w:r>
-      <w:r>
-        <w:rPr>
-          <w:sz w:val="24"/>
-          <w:szCs w:val="24"/>
-        </w:rPr>
-        <w:t xml:space="preserve"> of accessing the context value with class components</w:t>
-      </w:r>
-    </w:p>
-    <w:p>
-      <w:pPr>
-        <w:pStyle w:val="ListParagraph"/>
-        <w:numPr>
-          <w:ilvl w:val="1"/>
-          <w:numId w:val="1"/>
-        </w:numPr>
-        <w:rPr>
-          <w:sz w:val="24"/>
-          <w:szCs w:val="24"/>
-        </w:rPr>
-      </w:pPr>
-      <w:r>
-        <w:rPr>
-          <w:sz w:val="24"/>
-          <w:szCs w:val="24"/>
-        </w:rPr>
-        <w:t>Limitations of accessing the context value w/ contextType</w:t>
-      </w:r>
-    </w:p>
-    <w:p>
-      <w:pPr>
-        <w:pStyle w:val="ListParagraph"/>
-        <w:numPr>
-          <w:ilvl w:val="0"/>
-          <w:numId w:val="1"/>
-        </w:numPr>
-        <w:rPr>
-          <w:sz w:val="24"/>
-          <w:szCs w:val="24"/>
-        </w:rPr>
-      </w:pPr>
-      <w:r>
-        <w:rPr>
-          <w:sz w:val="24"/>
-          <w:szCs w:val="24"/>
-        </w:rPr>
-        <w:t>HTTP Request</w:t>
-      </w:r>
-      <w:r>
-        <w:rPr>
-          <w:sz w:val="24"/>
-          <w:szCs w:val="24"/>
-        </w:rPr>
-        <w:t xml:space="preserve"> – get/post method using </w:t>
-      </w:r>
-      <w:proofErr w:type="spellStart"/>
-      <w:r>
-        <w:rPr>
-          <w:sz w:val="24"/>
-          <w:szCs w:val="24"/>
-        </w:rPr>
-        <w:t>axios</w:t>
-      </w:r>
-      <w:proofErr w:type="spellEnd"/>
-    </w:p>
-    <w:p>
-      <w:pPr>
-        <w:pStyle w:val="ListParagraph"/>
-        <w:numPr>
-          <w:ilvl w:val="0"/>
-          <w:numId w:val="1"/>
-        </w:numPr>
-        <w:rPr>
-          <w:sz w:val="24"/>
-          <w:szCs w:val="24"/>
-        </w:rPr>
-      </w:pPr>
-      <w:r>
-        <w:rPr>
-          <w:sz w:val="24"/>
-          <w:szCs w:val="24"/>
-        </w:rPr>
-        <w:t>R</w:t>
-      </w:r>
-      <w:r>
-        <w:rPr>
-          <w:sz w:val="24"/>
-          <w:szCs w:val="24"/>
-        </w:rPr>
-        <w:t>econciliation</w:t>
-      </w:r>
-    </w:p>
-    <w:p>
-      <w:pPr>
-        <w:pStyle w:val="ListParagraph"/>
-        <w:numPr>
-          <w:ilvl w:val="0"/>
-          <w:numId w:val="1"/>
-        </w:numPr>
-        <w:rPr>
-          <w:sz w:val="24"/>
-          <w:szCs w:val="24"/>
-        </w:rPr>
-      </w:pPr>
-      <w:r>
-        <w:rPr>
-          <w:sz w:val="24"/>
-          <w:szCs w:val="24"/>
-        </w:rPr>
-        <w:t>Synthetic Events</w:t>
-      </w:r>
-    </w:p>
-    <w:p>
-      <w:pPr>
-        <w:pStyle w:val="ListParagraph"/>
-        <w:numPr>
-          <w:ilvl w:val="0"/>
-          <w:numId w:val="1"/>
-        </w:numPr>
-        <w:rPr>
-          <w:sz w:val="24"/>
-          <w:szCs w:val="24"/>
-        </w:rPr>
-      </w:pPr>
-      <w:r>
-        <w:rPr>
-          <w:sz w:val="24"/>
-          <w:szCs w:val="24"/>
-        </w:rPr>
-        <w:t xml:space="preserve">What is </w:t>
-      </w:r>
-      <w:proofErr w:type="spellStart"/>
-      <w:r>
-        <w:rPr>
-          <w:sz w:val="24"/>
-          <w:szCs w:val="24"/>
-        </w:rPr>
-        <w:t>React.</w:t>
-      </w:r>
-      <w:r>
-        <w:rPr>
-          <w:sz w:val="24"/>
-          <w:szCs w:val="24"/>
-        </w:rPr>
-        <w:t>createRoot</w:t>
-      </w:r>
-      <w:proofErr w:type="spellEnd"/>
-      <w:r>
-        <w:rPr>
-          <w:sz w:val="24"/>
-          <w:szCs w:val="24"/>
-        </w:rPr>
-        <w:t xml:space="preserve"> </w:t>
-      </w:r>
-      <w:r>
-        <w:rPr>
-          <w:sz w:val="24"/>
-          <w:szCs w:val="24"/>
-        </w:rPr>
-        <w:t>()</w:t>
-      </w:r>
-    </w:p>
-    <w:p>
-      <w:pPr>
-        <w:pStyle w:val="ListParagraph"/>
-        <w:numPr>
-          <w:ilvl w:val="0"/>
-          <w:numId w:val="1"/>
-        </w:numPr>
-        <w:rPr>
-          <w:sz w:val="24"/>
-          <w:szCs w:val="24"/>
-        </w:rPr>
-      </w:pPr>
-      <w:r>
-        <w:rPr>
-          <w:sz w:val="24"/>
-          <w:szCs w:val="24"/>
-        </w:rPr>
-        <w:t>React hydrat</w:t>
-      </w:r>
-      <w:r>
-        <w:rPr>
-          <w:sz w:val="24"/>
-          <w:szCs w:val="24"/>
-        </w:rPr>
-        <w:t>e</w:t>
-      </w:r>
-    </w:p>
-    <w:p>
-      <w:pPr>
-        <w:rPr>
+          <w:numId w:val="9"/>
+        </w:numPr>
+        <w:rPr>
+          <w:sz w:val="24"/>
+          <w:szCs w:val="24"/>
+        </w:rPr>
+      </w:pPr>
+      <w:r>
+        <w:rPr>
+          <w:sz w:val="24"/>
+          <w:szCs w:val="24"/>
+        </w:rPr>
+        <w:t>What is preloaded state and initial state</w:t>
+      </w:r>
+      <w:r>
+        <w:rPr>
+          <w:sz w:val="24"/>
+          <w:szCs w:val="24"/>
+        </w:rPr>
+        <w:t xml:space="preserve"> in configure store function</w:t>
+      </w:r>
+      <w:r>
+        <w:rPr>
+          <w:sz w:val="24"/>
+          <w:szCs w:val="24"/>
+        </w:rPr>
+        <w:t>?</w:t>
+      </w:r>
+    </w:p>
+    <w:p>
+      <w:pPr>
+        <w:rPr>
+          <w:rFonts w:cstheme="minorHAnsi"/>
           <w:b/>
           <w:bCs/>
           <w:sz w:val="24"/>
@@ -1945,158 +127,12 @@
       </w:pPr>
       <w:r>
         <w:rPr>
+          <w:rFonts w:cstheme="minorHAnsi"/>
           <w:b/>
           <w:bCs/>
           <w:sz w:val="24"/>
           <w:szCs w:val="24"/>
         </w:rPr>
-        <w:t>REDUX TOOLKIT CONCEPTS</w:t>
-      </w:r>
-    </w:p>
-    <w:p>
-      <w:pPr>
-        <w:pStyle w:val="ListParagraph"/>
-        <w:numPr>
-          <w:ilvl w:val="0"/>
-          <w:numId w:val="9"/>
-        </w:numPr>
-        <w:rPr>
-          <w:sz w:val="24"/>
-          <w:szCs w:val="24"/>
-        </w:rPr>
-      </w:pPr>
-      <w:r>
-        <w:rPr>
-          <w:sz w:val="24"/>
-          <w:szCs w:val="24"/>
-        </w:rPr>
-        <w:t>Shortcomings of core redux</w:t>
-      </w:r>
-    </w:p>
-    <w:p>
-      <w:pPr>
-        <w:pStyle w:val="ListParagraph"/>
-        <w:numPr>
-          <w:ilvl w:val="0"/>
-          <w:numId w:val="9"/>
-        </w:numPr>
-        <w:rPr>
-          <w:sz w:val="24"/>
-          <w:szCs w:val="24"/>
-        </w:rPr>
-      </w:pPr>
-      <w:r>
-        <w:rPr>
-          <w:sz w:val="24"/>
-          <w:szCs w:val="24"/>
-        </w:rPr>
-        <w:t>What is redux toolkit? Why do we need it?</w:t>
-      </w:r>
-    </w:p>
-    <w:p>
-      <w:pPr>
-        <w:pStyle w:val="ListParagraph"/>
-        <w:numPr>
-          <w:ilvl w:val="0"/>
-          <w:numId w:val="9"/>
-        </w:numPr>
-        <w:rPr>
-          <w:sz w:val="24"/>
-          <w:szCs w:val="24"/>
-        </w:rPr>
-      </w:pPr>
-      <w:r>
-        <w:rPr>
-          <w:sz w:val="24"/>
-          <w:szCs w:val="24"/>
-        </w:rPr>
-        <w:t>Async actions</w:t>
-      </w:r>
-    </w:p>
-    <w:p>
-      <w:pPr>
-        <w:pStyle w:val="ListParagraph"/>
-        <w:numPr>
-          <w:ilvl w:val="0"/>
-          <w:numId w:val="9"/>
-        </w:numPr>
-        <w:rPr>
-          <w:sz w:val="24"/>
-          <w:szCs w:val="24"/>
-        </w:rPr>
-      </w:pPr>
-      <w:r>
-        <w:rPr>
-          <w:sz w:val="24"/>
-          <w:szCs w:val="24"/>
-        </w:rPr>
-        <w:t>What is preloaded state and initial state</w:t>
-      </w:r>
-      <w:r>
-        <w:rPr>
-          <w:sz w:val="24"/>
-          <w:szCs w:val="24"/>
-        </w:rPr>
-        <w:t xml:space="preserve"> in configure store function</w:t>
-      </w:r>
-      <w:r>
-        <w:rPr>
-          <w:sz w:val="24"/>
-          <w:szCs w:val="24"/>
-        </w:rPr>
-        <w:t>?</w:t>
-      </w:r>
-    </w:p>
-    <w:p>
-      <w:pPr>
-        <w:rPr>
-          <w:sz w:val="24"/>
-          <w:szCs w:val="24"/>
-        </w:rPr>
-      </w:pPr>
-    </w:p>
-    <w:p>
-      <w:pPr>
-        <w:rPr>
-          <w:sz w:val="24"/>
-          <w:szCs w:val="24"/>
-        </w:rPr>
-      </w:pPr>
-    </w:p>
-    <w:p>
-      <w:pPr>
-        <w:rPr>
-          <w:sz w:val="24"/>
-          <w:szCs w:val="24"/>
-        </w:rPr>
-      </w:pPr>
-    </w:p>
-    <w:p>
-      <w:pPr>
-        <w:rPr>
-          <w:sz w:val="24"/>
-          <w:szCs w:val="24"/>
-        </w:rPr>
-      </w:pPr>
-    </w:p>
-    <w:p>
-      <w:pPr>
-        <w:rPr>
-          <w:rFonts w:cstheme="minorHAnsi"/>
-          <w:b/>
-          <w:bCs/>
-          <w:sz w:val="24"/>
-          <w:szCs w:val="24"/>
-        </w:rPr>
-      </w:pPr>
-      <w:r>
-        <w:rPr>
-          <w:rFonts w:cstheme="minorHAnsi"/>
-          <w:b/>
-          <w:bCs/>
-          <w:sz w:val="24"/>
-          <w:szCs w:val="24"/>
-        </w:rPr>
         <w:t>React Typescript:</w:t>
       </w:r>
     </w:p>
@@ -2353,16 +389,7 @@
           <w:sz w:val="24"/>
           <w:szCs w:val="24"/>
         </w:rPr>
-        <w:t xml:space="preserve">: </w:t>
-      </w:r>
-      <w:proofErr w:type="spellStart"/>
-      <w:r>
-        <w:rPr>
-          <w:rFonts w:cstheme="minorHAnsi"/>
-          <w:sz w:val="24"/>
-          <w:szCs w:val="24"/>
-        </w:rPr>
-        <w:t>R</w:t>
+        <w:t>: R</w:t>
       </w:r>
       <w:r>
         <w:rPr>
@@ -2372,7 +399,6 @@
         </w:rPr>
         <w:t>eactNode</w:t>
       </w:r>
-      <w:proofErr w:type="spellEnd"/>
     </w:p>
     <w:p>
       <w:pPr>
@@ -2411,7 +437,6 @@
         </w:rPr>
         <w:t xml:space="preserve"> </w:t>
       </w:r>
-      <w:proofErr w:type="spellStart"/>
       <w:r>
         <w:rPr>
           <w:rFonts w:cstheme="minorHAnsi"/>
@@ -2420,7 +445,6 @@
         </w:rPr>
         <w:t>ReactNode</w:t>
       </w:r>
-      <w:proofErr w:type="spellEnd"/>
     </w:p>
     <w:p>
       <w:pPr>
@@ -2503,18 +527,8 @@
           <w:sz w:val="24"/>
           <w:szCs w:val="24"/>
         </w:rPr>
-        <w:t xml:space="preserve"> = React. </w:t>
-      </w:r>
-      <w:proofErr w:type="spellStart"/>
-      <w:r>
-        <w:rPr>
-          <w:rFonts w:cstheme="minorHAnsi"/>
-          <w:sz w:val="24"/>
-          <w:szCs w:val="24"/>
-        </w:rPr>
-        <w:t>ComponentType</w:t>
-      </w:r>
-      <w:proofErr w:type="spellEnd"/>
+        <w:t xml:space="preserve"> = React. ComponentType</w:t>
+      </w:r>
     </w:p>
     <w:p>
       <w:pPr>
@@ -2667,7 +681,6 @@
         </w:rPr>
         <w:t xml:space="preserve"> </w:t>
       </w:r>
-      <w:proofErr w:type="spellStart"/>
       <w:r>
         <w:rPr>
           <w:rFonts w:cstheme="minorHAnsi"/>
@@ -2676,7 +689,6 @@
         </w:rPr>
         <w:t>CSSProperties</w:t>
       </w:r>
-      <w:proofErr w:type="spellEnd"/>
     </w:p>
     <w:p>
       <w:pPr>
@@ -3215,6 +1227,7 @@
           <w:sz w:val="24"/>
           <w:szCs w:val="24"/>
         </w:rPr>
+        <w:lastRenderedPageBreak/>
         <w:t>Extracting props</w:t>
       </w:r>
     </w:p>

</xml_diff>

<commit_message>
Updated all the files and folders name of the project. Cleaned up few files and folders and un-necessary codes too.
</commit_message>
<xml_diff>
--- a/react-topics.docx
+++ b/react-topics.docx
@@ -5,119 +5,6 @@
     <w:p>
       <w:pPr>
         <w:rPr>
-          <w:b/>
-          <w:bCs/>
-          <w:sz w:val="24"/>
-          <w:szCs w:val="24"/>
-        </w:rPr>
-      </w:pPr>
-      <w:r>
-        <w:rPr>
-          <w:b/>
-          <w:bCs/>
-          <w:sz w:val="24"/>
-          <w:szCs w:val="24"/>
-        </w:rPr>
-        <w:t>REDUX TOOLKIT CONCEPTS</w:t>
-      </w:r>
-    </w:p>
-    <w:p>
-      <w:pPr>
-        <w:pStyle w:val="ListParagraph"/>
-        <w:numPr>
-          <w:ilvl w:val="0"/>
-          <w:numId w:val="9"/>
-        </w:numPr>
-        <w:rPr>
-          <w:sz w:val="24"/>
-          <w:szCs w:val="24"/>
-        </w:rPr>
-      </w:pPr>
-      <w:r>
-        <w:rPr>
-          <w:sz w:val="24"/>
-          <w:szCs w:val="24"/>
-        </w:rPr>
-        <w:t>Shortcomings of core redux</w:t>
-      </w:r>
-    </w:p>
-    <w:p>
-      <w:pPr>
-        <w:pStyle w:val="ListParagraph"/>
-        <w:numPr>
-          <w:ilvl w:val="0"/>
-          <w:numId w:val="9"/>
-        </w:numPr>
-        <w:rPr>
-          <w:sz w:val="24"/>
-          <w:szCs w:val="24"/>
-        </w:rPr>
-      </w:pPr>
-      <w:r>
-        <w:rPr>
-          <w:sz w:val="24"/>
-          <w:szCs w:val="24"/>
-        </w:rPr>
-        <w:t>What is redux toolkit? Why do we need it?</w:t>
-      </w:r>
-    </w:p>
-    <w:p>
-      <w:pPr>
-        <w:pStyle w:val="ListParagraph"/>
-        <w:numPr>
-          <w:ilvl w:val="0"/>
-          <w:numId w:val="9"/>
-        </w:numPr>
-        <w:rPr>
-          <w:sz w:val="24"/>
-          <w:szCs w:val="24"/>
-        </w:rPr>
-      </w:pPr>
-      <w:r>
-        <w:rPr>
-          <w:sz w:val="24"/>
-          <w:szCs w:val="24"/>
-        </w:rPr>
-        <w:t>Async actions</w:t>
-      </w:r>
-    </w:p>
-    <w:p>
-      <w:pPr>
-        <w:pStyle w:val="ListParagraph"/>
-        <w:numPr>
-          <w:ilvl w:val="0"/>
-          <w:numId w:val="9"/>
-        </w:numPr>
-        <w:rPr>
-          <w:sz w:val="24"/>
-          <w:szCs w:val="24"/>
-        </w:rPr>
-      </w:pPr>
-      <w:r>
-        <w:rPr>
-          <w:sz w:val="24"/>
-          <w:szCs w:val="24"/>
-        </w:rPr>
-        <w:t>What is preloaded state and initial state</w:t>
-      </w:r>
-      <w:r>
-        <w:rPr>
-          <w:sz w:val="24"/>
-          <w:szCs w:val="24"/>
-        </w:rPr>
-        <w:t xml:space="preserve"> in configure store function</w:t>
-      </w:r>
-      <w:r>
-        <w:rPr>
-          <w:sz w:val="24"/>
-          <w:szCs w:val="24"/>
-        </w:rPr>
-        <w:t>?</w:t>
-      </w:r>
-    </w:p>
-    <w:p>
-      <w:pPr>
-        <w:rPr>
           <w:rFonts w:cstheme="minorHAnsi"/>
           <w:b/>
           <w:bCs/>
@@ -155,15 +42,51 @@
           <w:sz w:val="24"/>
           <w:szCs w:val="24"/>
         </w:rPr>
-        <w:t xml:space="preserve">Basic Prop Types – </w:t>
-      </w:r>
-      <w:r>
-        <w:rPr>
-          <w:rFonts w:cstheme="minorHAnsi"/>
-          <w:sz w:val="24"/>
-          <w:szCs w:val="24"/>
-        </w:rPr>
-        <w:t>number, string, boolean, null, string literal</w:t>
+        <w:t>Props types and tips</w:t>
+      </w:r>
+    </w:p>
+    <w:p>
+      <w:pPr>
+        <w:pStyle w:val="ListParagraph"/>
+        <w:numPr>
+          <w:ilvl w:val="1"/>
+          <w:numId w:val="5"/>
+        </w:numPr>
+        <w:rPr>
+          <w:rFonts w:cstheme="minorHAnsi"/>
+          <w:sz w:val="24"/>
+          <w:szCs w:val="24"/>
+        </w:rPr>
+      </w:pPr>
+      <w:r>
+        <w:rPr>
+          <w:rFonts w:cstheme="minorHAnsi"/>
+          <w:sz w:val="24"/>
+          <w:szCs w:val="24"/>
+        </w:rPr>
+        <w:t>Destructuring Props</w:t>
+      </w:r>
+    </w:p>
+    <w:p>
+      <w:pPr>
+        <w:pStyle w:val="ListParagraph"/>
+        <w:numPr>
+          <w:ilvl w:val="1"/>
+          <w:numId w:val="5"/>
+        </w:numPr>
+        <w:rPr>
+          <w:rFonts w:cstheme="minorHAnsi"/>
+          <w:sz w:val="24"/>
+          <w:szCs w:val="24"/>
+        </w:rPr>
+      </w:pPr>
+      <w:r>
+        <w:rPr>
+          <w:rFonts w:cstheme="minorHAnsi"/>
+          <w:sz w:val="24"/>
+          <w:szCs w:val="24"/>
+        </w:rPr>
+        <w:t>Defining Prop Types in a separate file to make use of readability</w:t>
       </w:r>
     </w:p>
     <w:p>
@@ -185,15 +108,309 @@
           <w:sz w:val="24"/>
           <w:szCs w:val="24"/>
         </w:rPr>
-        <w:t xml:space="preserve">Object </w:t>
-      </w:r>
-      <w:r>
-        <w:rPr>
-          <w:rFonts w:cstheme="minorHAnsi"/>
-          <w:sz w:val="24"/>
-          <w:szCs w:val="24"/>
-        </w:rPr>
-        <w:t>Prop Type</w:t>
+        <w:t>useState Hook</w:t>
+      </w:r>
+    </w:p>
+    <w:p>
+      <w:pPr>
+        <w:pStyle w:val="ListParagraph"/>
+        <w:numPr>
+          <w:ilvl w:val="1"/>
+          <w:numId w:val="5"/>
+        </w:numPr>
+        <w:rPr>
+          <w:rFonts w:cstheme="minorHAnsi"/>
+          <w:sz w:val="24"/>
+          <w:szCs w:val="24"/>
+        </w:rPr>
+      </w:pPr>
+      <w:r>
+        <w:rPr>
+          <w:rFonts w:cstheme="minorHAnsi"/>
+          <w:sz w:val="24"/>
+          <w:szCs w:val="24"/>
+        </w:rPr>
+        <w:t>For simple datatypes</w:t>
+      </w:r>
+      <w:r>
+        <w:rPr>
+          <w:rFonts w:cstheme="minorHAnsi"/>
+          <w:sz w:val="24"/>
+          <w:szCs w:val="24"/>
+        </w:rPr>
+        <w:t xml:space="preserve"> such as number, boolean, strin</w:t>
+      </w:r>
+      <w:r>
+        <w:rPr>
+          <w:rFonts w:cstheme="minorHAnsi"/>
+          <w:sz w:val="24"/>
+          <w:szCs w:val="24"/>
+        </w:rPr>
+        <w:t>g</w:t>
+      </w:r>
+      <w:r>
+        <w:rPr>
+          <w:rFonts w:cstheme="minorHAnsi"/>
+          <w:sz w:val="24"/>
+          <w:szCs w:val="24"/>
+        </w:rPr>
+        <w:t>, w</w:t>
+      </w:r>
+      <w:r>
+        <w:rPr>
+          <w:rFonts w:cstheme="minorHAnsi"/>
+          <w:sz w:val="24"/>
+          <w:szCs w:val="24"/>
+        </w:rPr>
+        <w:t>e actually don’t need to worry about type inference</w:t>
+      </w:r>
+      <w:r>
+        <w:rPr>
+          <w:rFonts w:cstheme="minorHAnsi"/>
+          <w:sz w:val="24"/>
+          <w:szCs w:val="24"/>
+        </w:rPr>
+        <w:t>,</w:t>
+      </w:r>
+      <w:r>
+        <w:rPr>
+          <w:rFonts w:cstheme="minorHAnsi"/>
+          <w:sz w:val="24"/>
+          <w:szCs w:val="24"/>
+        </w:rPr>
+        <w:t xml:space="preserve"> react will take care of it</w:t>
+      </w:r>
+      <w:r>
+        <w:rPr>
+          <w:rFonts w:cstheme="minorHAnsi"/>
+          <w:sz w:val="24"/>
+          <w:szCs w:val="24"/>
+        </w:rPr>
+        <w:t xml:space="preserve"> automatically based on the initial value.</w:t>
+      </w:r>
+      <w:r>
+        <w:rPr>
+          <w:rFonts w:cstheme="minorHAnsi"/>
+          <w:sz w:val="24"/>
+          <w:szCs w:val="24"/>
+        </w:rPr>
+        <w:t xml:space="preserve"> </w:t>
+      </w:r>
+      <w:r>
+        <w:rPr>
+          <w:rFonts w:cstheme="minorHAnsi"/>
+          <w:sz w:val="24"/>
+          <w:szCs w:val="24"/>
+        </w:rPr>
+        <w:t>[</w:t>
+      </w:r>
+      <w:r>
+        <w:rPr>
+          <w:rFonts w:cstheme="minorHAnsi"/>
+          <w:i/>
+          <w:iCs/>
+          <w:sz w:val="24"/>
+          <w:szCs w:val="24"/>
+        </w:rPr>
+        <w:t>Example, if you’ve a state variable’s initial value as boolean, throughout the component its value will be boolean only. If we pass zero, it will still throw an error.</w:t>
+      </w:r>
+      <w:r>
+        <w:rPr>
+          <w:rFonts w:cstheme="minorHAnsi"/>
+          <w:i/>
+          <w:iCs/>
+          <w:sz w:val="24"/>
+          <w:szCs w:val="24"/>
+        </w:rPr>
+        <w:t>]</w:t>
+      </w:r>
+    </w:p>
+    <w:p>
+      <w:pPr>
+        <w:pStyle w:val="ListParagraph"/>
+        <w:numPr>
+          <w:ilvl w:val="1"/>
+          <w:numId w:val="5"/>
+        </w:numPr>
+        <w:rPr>
+          <w:rFonts w:cstheme="minorHAnsi"/>
+          <w:sz w:val="24"/>
+          <w:szCs w:val="24"/>
+        </w:rPr>
+      </w:pPr>
+      <w:r>
+        <w:rPr>
+          <w:rFonts w:cstheme="minorHAnsi"/>
+          <w:sz w:val="24"/>
+          <w:szCs w:val="24"/>
+        </w:rPr>
+        <w:t xml:space="preserve">useState Hook Future – </w:t>
+      </w:r>
+      <w:r>
+        <w:rPr>
+          <w:rFonts w:cstheme="minorHAnsi"/>
+          <w:sz w:val="24"/>
+          <w:szCs w:val="24"/>
+        </w:rPr>
+        <w:t>If we’re not sure about the initial state value, it may be anything in future</w:t>
+      </w:r>
+      <w:r>
+        <w:rPr>
+          <w:rFonts w:cstheme="minorHAnsi"/>
+          <w:sz w:val="24"/>
+          <w:szCs w:val="24"/>
+        </w:rPr>
+        <w:t>.</w:t>
+      </w:r>
+      <w:r>
+        <w:rPr>
+          <w:rFonts w:cstheme="minorHAnsi"/>
+          <w:sz w:val="24"/>
+          <w:szCs w:val="24"/>
+        </w:rPr>
+        <w:t xml:space="preserve"> </w:t>
+      </w:r>
+      <w:r>
+        <w:rPr>
+          <w:rFonts w:cstheme="minorHAnsi"/>
+          <w:i/>
+          <w:iCs/>
+          <w:sz w:val="24"/>
+          <w:szCs w:val="24"/>
+        </w:rPr>
+        <w:t xml:space="preserve">Like, initially we can have null and later some days, we may define some values to </w:t>
+      </w:r>
+      <w:r>
+        <w:rPr>
+          <w:rFonts w:cstheme="minorHAnsi"/>
+          <w:i/>
+          <w:iCs/>
+          <w:sz w:val="24"/>
+          <w:szCs w:val="24"/>
+        </w:rPr>
+        <w:t>useState (</w:t>
+      </w:r>
+      <w:r>
+        <w:rPr>
+          <w:rFonts w:cstheme="minorHAnsi"/>
+          <w:i/>
+          <w:iCs/>
+          <w:sz w:val="24"/>
+          <w:szCs w:val="24"/>
+        </w:rPr>
+        <w:t>). At that time, we have to define the type inference</w:t>
+      </w:r>
+      <w:r>
+        <w:rPr>
+          <w:rFonts w:cstheme="minorHAnsi"/>
+          <w:i/>
+          <w:iCs/>
+          <w:sz w:val="24"/>
+          <w:szCs w:val="24"/>
+        </w:rPr>
+        <w:t xml:space="preserve">. </w:t>
+      </w:r>
+      <w:r>
+        <w:rPr>
+          <w:rFonts w:cstheme="minorHAnsi"/>
+          <w:i/>
+          <w:iCs/>
+          <w:sz w:val="24"/>
+          <w:szCs w:val="24"/>
+        </w:rPr>
+        <w:t xml:space="preserve">Now it could be null or </w:t>
+      </w:r>
+      <w:r>
+        <w:rPr>
+          <w:rFonts w:cstheme="minorHAnsi"/>
+          <w:i/>
+          <w:iCs/>
+          <w:sz w:val="24"/>
+          <w:szCs w:val="24"/>
+        </w:rPr>
+        <w:t>any datatype</w:t>
+      </w:r>
+      <w:r>
+        <w:rPr>
+          <w:rFonts w:cstheme="minorHAnsi"/>
+          <w:i/>
+          <w:iCs/>
+          <w:sz w:val="24"/>
+          <w:szCs w:val="24"/>
+        </w:rPr>
+        <w:t xml:space="preserve">. </w:t>
+      </w:r>
+      <w:r>
+        <w:rPr>
+          <w:rFonts w:cstheme="minorHAnsi"/>
+          <w:i/>
+          <w:iCs/>
+          <w:sz w:val="24"/>
+          <w:szCs w:val="24"/>
+        </w:rPr>
+        <w:t>However,</w:t>
+      </w:r>
+      <w:r>
+        <w:rPr>
+          <w:rFonts w:cstheme="minorHAnsi"/>
+          <w:i/>
+          <w:iCs/>
+          <w:sz w:val="24"/>
+          <w:szCs w:val="24"/>
+        </w:rPr>
+        <w:t xml:space="preserve"> </w:t>
+      </w:r>
+      <w:r>
+        <w:rPr>
+          <w:rFonts w:cstheme="minorHAnsi"/>
+          <w:i/>
+          <w:iCs/>
+          <w:sz w:val="24"/>
+          <w:szCs w:val="24"/>
+        </w:rPr>
+        <w:t>we’re</w:t>
+      </w:r>
+      <w:r>
+        <w:rPr>
+          <w:rFonts w:cstheme="minorHAnsi"/>
+          <w:i/>
+          <w:iCs/>
+          <w:sz w:val="24"/>
+          <w:szCs w:val="24"/>
+        </w:rPr>
+        <w:t xml:space="preserve"> setting a null as optional type to the initial value of useState, we have to put a check on</w:t>
+      </w:r>
+      <w:r>
+        <w:rPr>
+          <w:rFonts w:cstheme="minorHAnsi"/>
+          <w:i/>
+          <w:iCs/>
+          <w:sz w:val="24"/>
+          <w:szCs w:val="24"/>
+        </w:rPr>
+        <w:t xml:space="preserve"> variable using optional chaining operator.</w:t>
+      </w:r>
+    </w:p>
+    <w:p>
+      <w:pPr>
+        <w:pStyle w:val="ListParagraph"/>
+        <w:numPr>
+          <w:ilvl w:val="1"/>
+          <w:numId w:val="5"/>
+        </w:numPr>
+        <w:rPr>
+          <w:rFonts w:cstheme="minorHAnsi"/>
+          <w:sz w:val="24"/>
+          <w:szCs w:val="24"/>
+        </w:rPr>
+      </w:pPr>
+      <w:r>
+        <w:rPr>
+          <w:rFonts w:cstheme="minorHAnsi"/>
+          <w:sz w:val="24"/>
+          <w:szCs w:val="24"/>
+        </w:rPr>
+        <w:t>Type assertion</w:t>
       </w:r>
     </w:p>
     <w:p>
@@ -215,89 +432,15 @@
           <w:sz w:val="24"/>
           <w:szCs w:val="24"/>
         </w:rPr>
-        <w:t xml:space="preserve">Array </w:t>
-      </w:r>
-      <w:r>
-        <w:rPr>
-          <w:rFonts w:cstheme="minorHAnsi"/>
-          <w:sz w:val="24"/>
-          <w:szCs w:val="24"/>
-        </w:rPr>
-        <w:t>Prop</w:t>
-      </w:r>
-    </w:p>
-    <w:p>
-      <w:pPr>
-        <w:pStyle w:val="ListParagraph"/>
-        <w:numPr>
-          <w:ilvl w:val="1"/>
-          <w:numId w:val="5"/>
-        </w:numPr>
-        <w:rPr>
-          <w:rFonts w:cstheme="minorHAnsi"/>
-          <w:sz w:val="24"/>
-          <w:szCs w:val="24"/>
-        </w:rPr>
-      </w:pPr>
-      <w:r>
-        <w:rPr>
-          <w:rFonts w:cstheme="minorHAnsi"/>
-          <w:sz w:val="24"/>
-          <w:szCs w:val="24"/>
-        </w:rPr>
-        <w:t>Array String/Number/Boolean type</w:t>
-      </w:r>
-    </w:p>
-    <w:p>
-      <w:pPr>
-        <w:pStyle w:val="ListParagraph"/>
-        <w:numPr>
-          <w:ilvl w:val="1"/>
-          <w:numId w:val="5"/>
-        </w:numPr>
-        <w:rPr>
-          <w:rFonts w:cstheme="minorHAnsi"/>
-          <w:sz w:val="24"/>
-          <w:szCs w:val="24"/>
-        </w:rPr>
-      </w:pPr>
-      <w:r>
-        <w:rPr>
-          <w:rFonts w:cstheme="minorHAnsi"/>
-          <w:sz w:val="24"/>
-          <w:szCs w:val="24"/>
-        </w:rPr>
-        <w:t>Array Mixed Type</w:t>
-      </w:r>
-    </w:p>
-    <w:p>
-      <w:pPr>
-        <w:pStyle w:val="ListParagraph"/>
-        <w:numPr>
-          <w:ilvl w:val="1"/>
-          <w:numId w:val="5"/>
-        </w:numPr>
-        <w:rPr>
-          <w:rFonts w:cstheme="minorHAnsi"/>
-          <w:sz w:val="24"/>
-          <w:szCs w:val="24"/>
-        </w:rPr>
-      </w:pPr>
-      <w:r>
-        <w:rPr>
-          <w:rFonts w:cstheme="minorHAnsi"/>
-          <w:sz w:val="24"/>
-          <w:szCs w:val="24"/>
-        </w:rPr>
-        <w:t>Array of Object</w:t>
-      </w:r>
-      <w:r>
-        <w:rPr>
-          <w:rFonts w:cstheme="minorHAnsi"/>
-          <w:sz w:val="24"/>
-          <w:szCs w:val="24"/>
-        </w:rPr>
-        <w:t xml:space="preserve"> Type</w:t>
+        <w:t>useReducer Hook</w:t>
+      </w:r>
+      <w:r>
+        <w:rPr>
+          <w:rFonts w:cstheme="minorHAnsi"/>
+          <w:sz w:val="24"/>
+          <w:szCs w:val="24"/>
+        </w:rPr>
+        <w:t xml:space="preserve"> – Discriminated Union Feature</w:t>
       </w:r>
     </w:p>
     <w:p>
@@ -309,41 +452,19 @@
         </w:numPr>
         <w:rPr>
           <w:rFonts w:cstheme="minorHAnsi"/>
-          <w:sz w:val="24"/>
-          <w:szCs w:val="24"/>
-        </w:rPr>
-      </w:pPr>
-      <w:r>
-        <w:rPr>
-          <w:rFonts w:cstheme="minorHAnsi"/>
-          <w:sz w:val="24"/>
-          <w:szCs w:val="24"/>
-        </w:rPr>
-        <w:t>Children</w:t>
-      </w:r>
-      <w:r>
-        <w:rPr>
-          <w:rFonts w:cstheme="minorHAnsi"/>
-          <w:sz w:val="24"/>
-          <w:szCs w:val="24"/>
-        </w:rPr>
-        <w:t xml:space="preserve"> Props = T</w:t>
-      </w:r>
-      <w:r>
-        <w:rPr>
-          <w:rFonts w:cstheme="minorHAnsi"/>
-          <w:sz w:val="24"/>
-          <w:szCs w:val="24"/>
-        </w:rPr>
-        <w:t>ext</w:t>
-      </w:r>
-      <w:r>
-        <w:rPr>
-          <w:rFonts w:cstheme="minorHAnsi"/>
-          <w:sz w:val="24"/>
-          <w:szCs w:val="24"/>
-        </w:rPr>
-        <w:t>: string</w:t>
+          <w:color w:val="FF0000"/>
+          <w:sz w:val="24"/>
+          <w:szCs w:val="24"/>
+        </w:rPr>
+      </w:pPr>
+      <w:r>
+        <w:rPr>
+          <w:rFonts w:cstheme="minorHAnsi"/>
+          <w:color w:val="FF0000"/>
+          <w:sz w:val="24"/>
+          <w:szCs w:val="24"/>
+        </w:rPr>
+        <w:t>useContext</w:t>
       </w:r>
     </w:p>
     <w:p>
@@ -365,39 +486,15 @@
           <w:sz w:val="24"/>
           <w:szCs w:val="24"/>
         </w:rPr>
-        <w:t xml:space="preserve">Children Props </w:t>
-      </w:r>
-      <w:r>
-        <w:rPr>
-          <w:rFonts w:cstheme="minorHAnsi"/>
-          <w:sz w:val="24"/>
-          <w:szCs w:val="24"/>
-        </w:rPr>
-        <w:t>=</w:t>
-      </w:r>
-      <w:r>
-        <w:rPr>
-          <w:rFonts w:cstheme="minorHAnsi"/>
-          <w:sz w:val="24"/>
-          <w:szCs w:val="24"/>
-        </w:rPr>
-        <w:t xml:space="preserve"> HTML Element</w:t>
-      </w:r>
-      <w:r>
-        <w:rPr>
-          <w:rFonts w:cstheme="minorHAnsi"/>
-          <w:sz w:val="24"/>
-          <w:szCs w:val="24"/>
-        </w:rPr>
-        <w:t>: R</w:t>
-      </w:r>
-      <w:r>
-        <w:rPr>
-          <w:rFonts w:cstheme="minorHAnsi"/>
-          <w:sz w:val="24"/>
-          <w:szCs w:val="24"/>
-        </w:rPr>
-        <w:t>eactNode</w:t>
+        <w:t>useRef – Non null assertion operator</w:t>
+      </w:r>
+      <w:r>
+        <w:rPr>
+          <w:rFonts w:cstheme="minorHAnsi"/>
+          <w:sz w:val="24"/>
+          <w:szCs w:val="24"/>
+        </w:rPr>
+        <w:t xml:space="preserve"> is used to access ref w/o optional chaining</w:t>
       </w:r>
     </w:p>
     <w:p>
@@ -419,31 +516,7 @@
           <w:sz w:val="24"/>
           <w:szCs w:val="24"/>
         </w:rPr>
-        <w:t>Children Props = Another Component:</w:t>
-      </w:r>
-      <w:r>
-        <w:rPr>
-          <w:rFonts w:cstheme="minorHAnsi"/>
-          <w:sz w:val="24"/>
-          <w:szCs w:val="24"/>
-        </w:rPr>
-        <w:t xml:space="preserve"> React.</w:t>
-      </w:r>
-      <w:r>
-        <w:rPr>
-          <w:rFonts w:cstheme="minorHAnsi"/>
-          <w:sz w:val="24"/>
-          <w:szCs w:val="24"/>
-        </w:rPr>
-        <w:t xml:space="preserve"> </w:t>
-      </w:r>
-      <w:r>
-        <w:rPr>
-          <w:rFonts w:cstheme="minorHAnsi"/>
-          <w:sz w:val="24"/>
-          <w:szCs w:val="24"/>
-        </w:rPr>
-        <w:t>ReactNode</w:t>
+        <w:t>Restricting props</w:t>
       </w:r>
     </w:p>
     <w:p>
@@ -465,769 +538,6 @@
           <w:sz w:val="24"/>
           <w:szCs w:val="24"/>
         </w:rPr>
-        <w:t xml:space="preserve"> </w:t>
-      </w:r>
-      <w:r>
-        <w:rPr>
-          <w:rFonts w:cstheme="minorHAnsi"/>
-          <w:sz w:val="24"/>
-          <w:szCs w:val="24"/>
-        </w:rPr>
-        <w:t xml:space="preserve">Class </w:t>
-      </w:r>
-      <w:r>
-        <w:rPr>
-          <w:rFonts w:cstheme="minorHAnsi"/>
-          <w:sz w:val="24"/>
-          <w:szCs w:val="24"/>
-        </w:rPr>
-        <w:t>C</w:t>
-      </w:r>
-      <w:r>
-        <w:rPr>
-          <w:rFonts w:cstheme="minorHAnsi"/>
-          <w:sz w:val="24"/>
-          <w:szCs w:val="24"/>
-        </w:rPr>
-        <w:t xml:space="preserve">omponent </w:t>
-      </w:r>
-      <w:r>
-        <w:rPr>
-          <w:rFonts w:cstheme="minorHAnsi"/>
-          <w:sz w:val="24"/>
-          <w:szCs w:val="24"/>
-        </w:rPr>
-        <w:t>Prop Type</w:t>
-      </w:r>
-    </w:p>
-    <w:p>
-      <w:pPr>
-        <w:pStyle w:val="ListParagraph"/>
-        <w:numPr>
-          <w:ilvl w:val="0"/>
-          <w:numId w:val="5"/>
-        </w:numPr>
-        <w:rPr>
-          <w:rFonts w:cstheme="minorHAnsi"/>
-          <w:sz w:val="24"/>
-          <w:szCs w:val="24"/>
-        </w:rPr>
-      </w:pPr>
-      <w:r>
-        <w:rPr>
-          <w:rFonts w:cstheme="minorHAnsi"/>
-          <w:sz w:val="24"/>
-          <w:szCs w:val="24"/>
-        </w:rPr>
-        <w:t>Component as a prop</w:t>
-      </w:r>
-      <w:r>
-        <w:rPr>
-          <w:rFonts w:cstheme="minorHAnsi"/>
-          <w:sz w:val="24"/>
-          <w:szCs w:val="24"/>
-        </w:rPr>
-        <w:t xml:space="preserve"> = React. ComponentType</w:t>
-      </w:r>
-    </w:p>
-    <w:p>
-      <w:pPr>
-        <w:pStyle w:val="ListParagraph"/>
-        <w:numPr>
-          <w:ilvl w:val="0"/>
-          <w:numId w:val="5"/>
-        </w:numPr>
-        <w:rPr>
-          <w:rFonts w:cstheme="minorHAnsi"/>
-          <w:sz w:val="24"/>
-          <w:szCs w:val="24"/>
-        </w:rPr>
-      </w:pPr>
-      <w:r>
-        <w:rPr>
-          <w:rFonts w:cstheme="minorHAnsi"/>
-          <w:sz w:val="24"/>
-          <w:szCs w:val="24"/>
-        </w:rPr>
-        <w:t xml:space="preserve">Optional </w:t>
-      </w:r>
-      <w:r>
-        <w:rPr>
-          <w:rFonts w:cstheme="minorHAnsi"/>
-          <w:sz w:val="24"/>
-          <w:szCs w:val="24"/>
-        </w:rPr>
-        <w:t>Prop</w:t>
-      </w:r>
-    </w:p>
-    <w:p>
-      <w:pPr>
-        <w:pStyle w:val="ListParagraph"/>
-        <w:numPr>
-          <w:ilvl w:val="0"/>
-          <w:numId w:val="5"/>
-        </w:numPr>
-        <w:rPr>
-          <w:rFonts w:cstheme="minorHAnsi"/>
-          <w:sz w:val="24"/>
-          <w:szCs w:val="24"/>
-        </w:rPr>
-      </w:pPr>
-      <w:r>
-        <w:rPr>
-          <w:rFonts w:cstheme="minorHAnsi"/>
-          <w:sz w:val="24"/>
-          <w:szCs w:val="24"/>
-        </w:rPr>
-        <w:t>String Literal Prop Types</w:t>
-      </w:r>
-      <w:r>
-        <w:rPr>
-          <w:rFonts w:cstheme="minorHAnsi"/>
-          <w:sz w:val="24"/>
-          <w:szCs w:val="24"/>
-        </w:rPr>
-        <w:t xml:space="preserve"> + Discriminat</w:t>
-      </w:r>
-      <w:r>
-        <w:rPr>
-          <w:rFonts w:cstheme="minorHAnsi"/>
-          <w:sz w:val="24"/>
-          <w:szCs w:val="24"/>
-        </w:rPr>
-        <w:t>ed Union</w:t>
-      </w:r>
-      <w:r>
-        <w:rPr>
-          <w:rFonts w:cstheme="minorHAnsi"/>
-          <w:sz w:val="24"/>
-          <w:szCs w:val="24"/>
-        </w:rPr>
-        <w:t xml:space="preserve"> Feature</w:t>
-      </w:r>
-    </w:p>
-    <w:p>
-      <w:pPr>
-        <w:pStyle w:val="ListParagraph"/>
-        <w:numPr>
-          <w:ilvl w:val="0"/>
-          <w:numId w:val="5"/>
-        </w:numPr>
-        <w:rPr>
-          <w:rFonts w:cstheme="minorHAnsi"/>
-          <w:sz w:val="24"/>
-          <w:szCs w:val="24"/>
-        </w:rPr>
-      </w:pPr>
-      <w:r>
-        <w:rPr>
-          <w:rFonts w:cstheme="minorHAnsi"/>
-          <w:sz w:val="24"/>
-          <w:szCs w:val="24"/>
-        </w:rPr>
-        <w:t xml:space="preserve">Event </w:t>
-      </w:r>
-      <w:r>
-        <w:rPr>
-          <w:rFonts w:cstheme="minorHAnsi"/>
-          <w:sz w:val="24"/>
-          <w:szCs w:val="24"/>
-        </w:rPr>
-        <w:t>Props</w:t>
-      </w:r>
-    </w:p>
-    <w:p>
-      <w:pPr>
-        <w:pStyle w:val="ListParagraph"/>
-        <w:numPr>
-          <w:ilvl w:val="0"/>
-          <w:numId w:val="5"/>
-        </w:numPr>
-        <w:rPr>
-          <w:rFonts w:cstheme="minorHAnsi"/>
-          <w:sz w:val="24"/>
-          <w:szCs w:val="24"/>
-        </w:rPr>
-      </w:pPr>
-      <w:r>
-        <w:rPr>
-          <w:rFonts w:cstheme="minorHAnsi"/>
-          <w:sz w:val="24"/>
-          <w:szCs w:val="24"/>
-        </w:rPr>
-        <w:t xml:space="preserve">Styles </w:t>
-      </w:r>
-      <w:r>
-        <w:rPr>
-          <w:rFonts w:cstheme="minorHAnsi"/>
-          <w:sz w:val="24"/>
-          <w:szCs w:val="24"/>
-        </w:rPr>
-        <w:t>Prop Type</w:t>
-      </w:r>
-      <w:r>
-        <w:rPr>
-          <w:rFonts w:cstheme="minorHAnsi"/>
-          <w:sz w:val="24"/>
-          <w:szCs w:val="24"/>
-        </w:rPr>
-        <w:t xml:space="preserve"> – React.</w:t>
-      </w:r>
-      <w:r>
-        <w:rPr>
-          <w:rFonts w:cstheme="minorHAnsi"/>
-          <w:sz w:val="24"/>
-          <w:szCs w:val="24"/>
-        </w:rPr>
-        <w:t xml:space="preserve"> </w:t>
-      </w:r>
-      <w:r>
-        <w:rPr>
-          <w:rFonts w:cstheme="minorHAnsi"/>
-          <w:sz w:val="24"/>
-          <w:szCs w:val="24"/>
-        </w:rPr>
-        <w:t>CSSProperties</w:t>
-      </w:r>
-    </w:p>
-    <w:p>
-      <w:pPr>
-        <w:pStyle w:val="ListParagraph"/>
-        <w:numPr>
-          <w:ilvl w:val="0"/>
-          <w:numId w:val="5"/>
-        </w:numPr>
-        <w:rPr>
-          <w:rFonts w:cstheme="minorHAnsi"/>
-          <w:sz w:val="24"/>
-          <w:szCs w:val="24"/>
-        </w:rPr>
-      </w:pPr>
-      <w:r>
-        <w:rPr>
-          <w:rFonts w:cstheme="minorHAnsi"/>
-          <w:sz w:val="24"/>
-          <w:szCs w:val="24"/>
-        </w:rPr>
-        <w:t>Props types and tips</w:t>
-      </w:r>
-    </w:p>
-    <w:p>
-      <w:pPr>
-        <w:pStyle w:val="ListParagraph"/>
-        <w:numPr>
-          <w:ilvl w:val="1"/>
-          <w:numId w:val="5"/>
-        </w:numPr>
-        <w:rPr>
-          <w:rFonts w:cstheme="minorHAnsi"/>
-          <w:sz w:val="24"/>
-          <w:szCs w:val="24"/>
-        </w:rPr>
-      </w:pPr>
-      <w:r>
-        <w:rPr>
-          <w:rFonts w:cstheme="minorHAnsi"/>
-          <w:sz w:val="24"/>
-          <w:szCs w:val="24"/>
-        </w:rPr>
-        <w:t>Destructuring Props</w:t>
-      </w:r>
-    </w:p>
-    <w:p>
-      <w:pPr>
-        <w:pStyle w:val="ListParagraph"/>
-        <w:numPr>
-          <w:ilvl w:val="1"/>
-          <w:numId w:val="5"/>
-        </w:numPr>
-        <w:rPr>
-          <w:rFonts w:cstheme="minorHAnsi"/>
-          <w:sz w:val="24"/>
-          <w:szCs w:val="24"/>
-        </w:rPr>
-      </w:pPr>
-      <w:r>
-        <w:rPr>
-          <w:rFonts w:cstheme="minorHAnsi"/>
-          <w:sz w:val="24"/>
-          <w:szCs w:val="24"/>
-        </w:rPr>
-        <w:t>Defining Prop Types in a separate file to make use of readability</w:t>
-      </w:r>
-    </w:p>
-    <w:p>
-      <w:pPr>
-        <w:pStyle w:val="ListParagraph"/>
-        <w:numPr>
-          <w:ilvl w:val="0"/>
-          <w:numId w:val="5"/>
-        </w:numPr>
-        <w:rPr>
-          <w:rFonts w:cstheme="minorHAnsi"/>
-          <w:sz w:val="24"/>
-          <w:szCs w:val="24"/>
-        </w:rPr>
-      </w:pPr>
-      <w:r>
-        <w:rPr>
-          <w:rFonts w:cstheme="minorHAnsi"/>
-          <w:sz w:val="24"/>
-          <w:szCs w:val="24"/>
-        </w:rPr>
-        <w:t>useState Hook</w:t>
-      </w:r>
-    </w:p>
-    <w:p>
-      <w:pPr>
-        <w:pStyle w:val="ListParagraph"/>
-        <w:numPr>
-          <w:ilvl w:val="1"/>
-          <w:numId w:val="5"/>
-        </w:numPr>
-        <w:rPr>
-          <w:rFonts w:cstheme="minorHAnsi"/>
-          <w:sz w:val="24"/>
-          <w:szCs w:val="24"/>
-        </w:rPr>
-      </w:pPr>
-      <w:r>
-        <w:rPr>
-          <w:rFonts w:cstheme="minorHAnsi"/>
-          <w:sz w:val="24"/>
-          <w:szCs w:val="24"/>
-        </w:rPr>
-        <w:t>For simple datatypes</w:t>
-      </w:r>
-      <w:r>
-        <w:rPr>
-          <w:rFonts w:cstheme="minorHAnsi"/>
-          <w:sz w:val="24"/>
-          <w:szCs w:val="24"/>
-        </w:rPr>
-        <w:t xml:space="preserve"> such as number, boolean, strin</w:t>
-      </w:r>
-      <w:r>
-        <w:rPr>
-          <w:rFonts w:cstheme="minorHAnsi"/>
-          <w:sz w:val="24"/>
-          <w:szCs w:val="24"/>
-        </w:rPr>
-        <w:t>g</w:t>
-      </w:r>
-      <w:r>
-        <w:rPr>
-          <w:rFonts w:cstheme="minorHAnsi"/>
-          <w:sz w:val="24"/>
-          <w:szCs w:val="24"/>
-        </w:rPr>
-        <w:t>, w</w:t>
-      </w:r>
-      <w:r>
-        <w:rPr>
-          <w:rFonts w:cstheme="minorHAnsi"/>
-          <w:sz w:val="24"/>
-          <w:szCs w:val="24"/>
-        </w:rPr>
-        <w:t>e actually don’t need to worry about type inference</w:t>
-      </w:r>
-      <w:r>
-        <w:rPr>
-          <w:rFonts w:cstheme="minorHAnsi"/>
-          <w:sz w:val="24"/>
-          <w:szCs w:val="24"/>
-        </w:rPr>
-        <w:t>,</w:t>
-      </w:r>
-      <w:r>
-        <w:rPr>
-          <w:rFonts w:cstheme="minorHAnsi"/>
-          <w:sz w:val="24"/>
-          <w:szCs w:val="24"/>
-        </w:rPr>
-        <w:t xml:space="preserve"> react will take care of it</w:t>
-      </w:r>
-      <w:r>
-        <w:rPr>
-          <w:rFonts w:cstheme="minorHAnsi"/>
-          <w:sz w:val="24"/>
-          <w:szCs w:val="24"/>
-        </w:rPr>
-        <w:t xml:space="preserve"> automatically based on the initial value.</w:t>
-      </w:r>
-      <w:r>
-        <w:rPr>
-          <w:rFonts w:cstheme="minorHAnsi"/>
-          <w:sz w:val="24"/>
-          <w:szCs w:val="24"/>
-        </w:rPr>
-        <w:t xml:space="preserve"> </w:t>
-      </w:r>
-      <w:r>
-        <w:rPr>
-          <w:rFonts w:cstheme="minorHAnsi"/>
-          <w:sz w:val="24"/>
-          <w:szCs w:val="24"/>
-        </w:rPr>
-        <w:t>[</w:t>
-      </w:r>
-      <w:r>
-        <w:rPr>
-          <w:rFonts w:cstheme="minorHAnsi"/>
-          <w:i/>
-          <w:iCs/>
-          <w:sz w:val="24"/>
-          <w:szCs w:val="24"/>
-        </w:rPr>
-        <w:t>Example, if you’ve a state variable’s initial value as boolean, throughout the component its value will be boolean only. If we pass zero, it will still throw an error.</w:t>
-      </w:r>
-      <w:r>
-        <w:rPr>
-          <w:rFonts w:cstheme="minorHAnsi"/>
-          <w:i/>
-          <w:iCs/>
-          <w:sz w:val="24"/>
-          <w:szCs w:val="24"/>
-        </w:rPr>
-        <w:t>]</w:t>
-      </w:r>
-    </w:p>
-    <w:p>
-      <w:pPr>
-        <w:pStyle w:val="ListParagraph"/>
-        <w:numPr>
-          <w:ilvl w:val="1"/>
-          <w:numId w:val="5"/>
-        </w:numPr>
-        <w:rPr>
-          <w:rFonts w:cstheme="minorHAnsi"/>
-          <w:sz w:val="24"/>
-          <w:szCs w:val="24"/>
-        </w:rPr>
-      </w:pPr>
-      <w:r>
-        <w:rPr>
-          <w:rFonts w:cstheme="minorHAnsi"/>
-          <w:sz w:val="24"/>
-          <w:szCs w:val="24"/>
-        </w:rPr>
-        <w:t xml:space="preserve">useState Hook Future – </w:t>
-      </w:r>
-      <w:r>
-        <w:rPr>
-          <w:rFonts w:cstheme="minorHAnsi"/>
-          <w:sz w:val="24"/>
-          <w:szCs w:val="24"/>
-        </w:rPr>
-        <w:t>If we’re not sure about the initial state value, it may be anything in future</w:t>
-      </w:r>
-      <w:r>
-        <w:rPr>
-          <w:rFonts w:cstheme="minorHAnsi"/>
-          <w:sz w:val="24"/>
-          <w:szCs w:val="24"/>
-        </w:rPr>
-        <w:t>.</w:t>
-      </w:r>
-      <w:r>
-        <w:rPr>
-          <w:rFonts w:cstheme="minorHAnsi"/>
-          <w:sz w:val="24"/>
-          <w:szCs w:val="24"/>
-        </w:rPr>
-        <w:t xml:space="preserve"> </w:t>
-      </w:r>
-      <w:r>
-        <w:rPr>
-          <w:rFonts w:cstheme="minorHAnsi"/>
-          <w:i/>
-          <w:iCs/>
-          <w:sz w:val="24"/>
-          <w:szCs w:val="24"/>
-        </w:rPr>
-        <w:t xml:space="preserve">Like, initially we can have null and later some days, we may define some values to </w:t>
-      </w:r>
-      <w:r>
-        <w:rPr>
-          <w:rFonts w:cstheme="minorHAnsi"/>
-          <w:i/>
-          <w:iCs/>
-          <w:sz w:val="24"/>
-          <w:szCs w:val="24"/>
-        </w:rPr>
-        <w:t>useState (</w:t>
-      </w:r>
-      <w:r>
-        <w:rPr>
-          <w:rFonts w:cstheme="minorHAnsi"/>
-          <w:i/>
-          <w:iCs/>
-          <w:sz w:val="24"/>
-          <w:szCs w:val="24"/>
-        </w:rPr>
-        <w:t>). At that time, we have to define the type inference</w:t>
-      </w:r>
-      <w:r>
-        <w:rPr>
-          <w:rFonts w:cstheme="minorHAnsi"/>
-          <w:i/>
-          <w:iCs/>
-          <w:sz w:val="24"/>
-          <w:szCs w:val="24"/>
-        </w:rPr>
-        <w:t xml:space="preserve">. </w:t>
-      </w:r>
-      <w:r>
-        <w:rPr>
-          <w:rFonts w:cstheme="minorHAnsi"/>
-          <w:i/>
-          <w:iCs/>
-          <w:sz w:val="24"/>
-          <w:szCs w:val="24"/>
-        </w:rPr>
-        <w:t xml:space="preserve">Now it could be null or </w:t>
-      </w:r>
-      <w:r>
-        <w:rPr>
-          <w:rFonts w:cstheme="minorHAnsi"/>
-          <w:i/>
-          <w:iCs/>
-          <w:sz w:val="24"/>
-          <w:szCs w:val="24"/>
-        </w:rPr>
-        <w:t>any datatype</w:t>
-      </w:r>
-      <w:r>
-        <w:rPr>
-          <w:rFonts w:cstheme="minorHAnsi"/>
-          <w:i/>
-          <w:iCs/>
-          <w:sz w:val="24"/>
-          <w:szCs w:val="24"/>
-        </w:rPr>
-        <w:t xml:space="preserve">. </w:t>
-      </w:r>
-      <w:r>
-        <w:rPr>
-          <w:rFonts w:cstheme="minorHAnsi"/>
-          <w:i/>
-          <w:iCs/>
-          <w:sz w:val="24"/>
-          <w:szCs w:val="24"/>
-        </w:rPr>
-        <w:t>However,</w:t>
-      </w:r>
-      <w:r>
-        <w:rPr>
-          <w:rFonts w:cstheme="minorHAnsi"/>
-          <w:i/>
-          <w:iCs/>
-          <w:sz w:val="24"/>
-          <w:szCs w:val="24"/>
-        </w:rPr>
-        <w:t xml:space="preserve"> </w:t>
-      </w:r>
-      <w:r>
-        <w:rPr>
-          <w:rFonts w:cstheme="minorHAnsi"/>
-          <w:i/>
-          <w:iCs/>
-          <w:sz w:val="24"/>
-          <w:szCs w:val="24"/>
-        </w:rPr>
-        <w:t>we’re</w:t>
-      </w:r>
-      <w:r>
-        <w:rPr>
-          <w:rFonts w:cstheme="minorHAnsi"/>
-          <w:i/>
-          <w:iCs/>
-          <w:sz w:val="24"/>
-          <w:szCs w:val="24"/>
-        </w:rPr>
-        <w:t xml:space="preserve"> setting a null as optional type to the initial value of useState, we have to put a check on</w:t>
-      </w:r>
-      <w:r>
-        <w:rPr>
-          <w:rFonts w:cstheme="minorHAnsi"/>
-          <w:i/>
-          <w:iCs/>
-          <w:sz w:val="24"/>
-          <w:szCs w:val="24"/>
-        </w:rPr>
-        <w:t xml:space="preserve"> variable using optional chaining operator.</w:t>
-      </w:r>
-    </w:p>
-    <w:p>
-      <w:pPr>
-        <w:pStyle w:val="ListParagraph"/>
-        <w:numPr>
-          <w:ilvl w:val="1"/>
-          <w:numId w:val="5"/>
-        </w:numPr>
-        <w:rPr>
-          <w:rFonts w:cstheme="minorHAnsi"/>
-          <w:sz w:val="24"/>
-          <w:szCs w:val="24"/>
-        </w:rPr>
-      </w:pPr>
-      <w:r>
-        <w:rPr>
-          <w:rFonts w:cstheme="minorHAnsi"/>
-          <w:sz w:val="24"/>
-          <w:szCs w:val="24"/>
-        </w:rPr>
-        <w:t>Type assertion</w:t>
-      </w:r>
-    </w:p>
-    <w:p>
-      <w:pPr>
-        <w:pStyle w:val="ListParagraph"/>
-        <w:numPr>
-          <w:ilvl w:val="0"/>
-          <w:numId w:val="5"/>
-        </w:numPr>
-        <w:rPr>
-          <w:rFonts w:cstheme="minorHAnsi"/>
-          <w:sz w:val="24"/>
-          <w:szCs w:val="24"/>
-        </w:rPr>
-      </w:pPr>
-      <w:r>
-        <w:rPr>
-          <w:rFonts w:cstheme="minorHAnsi"/>
-          <w:sz w:val="24"/>
-          <w:szCs w:val="24"/>
-        </w:rPr>
-        <w:t>useReducer Hook</w:t>
-      </w:r>
-      <w:r>
-        <w:rPr>
-          <w:rFonts w:cstheme="minorHAnsi"/>
-          <w:sz w:val="24"/>
-          <w:szCs w:val="24"/>
-        </w:rPr>
-        <w:t xml:space="preserve"> – Discriminated Union Feature</w:t>
-      </w:r>
-    </w:p>
-    <w:p>
-      <w:pPr>
-        <w:pStyle w:val="ListParagraph"/>
-        <w:numPr>
-          <w:ilvl w:val="0"/>
-          <w:numId w:val="5"/>
-        </w:numPr>
-        <w:rPr>
-          <w:rFonts w:cstheme="minorHAnsi"/>
-          <w:color w:val="FF0000"/>
-          <w:sz w:val="24"/>
-          <w:szCs w:val="24"/>
-        </w:rPr>
-      </w:pPr>
-      <w:r>
-        <w:rPr>
-          <w:rFonts w:cstheme="minorHAnsi"/>
-          <w:color w:val="FF0000"/>
-          <w:sz w:val="24"/>
-          <w:szCs w:val="24"/>
-        </w:rPr>
-        <w:t>useContext</w:t>
-      </w:r>
-    </w:p>
-    <w:p>
-      <w:pPr>
-        <w:pStyle w:val="ListParagraph"/>
-        <w:numPr>
-          <w:ilvl w:val="0"/>
-          <w:numId w:val="5"/>
-        </w:numPr>
-        <w:rPr>
-          <w:rFonts w:cstheme="minorHAnsi"/>
-          <w:sz w:val="24"/>
-          <w:szCs w:val="24"/>
-        </w:rPr>
-      </w:pPr>
-      <w:r>
-        <w:rPr>
-          <w:rFonts w:cstheme="minorHAnsi"/>
-          <w:sz w:val="24"/>
-          <w:szCs w:val="24"/>
-        </w:rPr>
-        <w:t>useRef – Non null assertion operator</w:t>
-      </w:r>
-      <w:r>
-        <w:rPr>
-          <w:rFonts w:cstheme="minorHAnsi"/>
-          <w:sz w:val="24"/>
-          <w:szCs w:val="24"/>
-        </w:rPr>
-        <w:t xml:space="preserve"> is used to access ref w/o optional chaining</w:t>
-      </w:r>
-    </w:p>
-    <w:p>
-      <w:pPr>
-        <w:pStyle w:val="ListParagraph"/>
-        <w:numPr>
-          <w:ilvl w:val="0"/>
-          <w:numId w:val="5"/>
-        </w:numPr>
-        <w:rPr>
-          <w:rFonts w:cstheme="minorHAnsi"/>
-          <w:sz w:val="24"/>
-          <w:szCs w:val="24"/>
-        </w:rPr>
-      </w:pPr>
-      <w:r>
-        <w:rPr>
-          <w:rFonts w:cstheme="minorHAnsi"/>
-          <w:sz w:val="24"/>
-          <w:szCs w:val="24"/>
-        </w:rPr>
-        <w:t>Restricting props</w:t>
-      </w:r>
-    </w:p>
-    <w:p>
-      <w:pPr>
-        <w:pStyle w:val="ListParagraph"/>
-        <w:numPr>
-          <w:ilvl w:val="0"/>
-          <w:numId w:val="5"/>
-        </w:numPr>
-        <w:rPr>
-          <w:rFonts w:cstheme="minorHAnsi"/>
-          <w:sz w:val="24"/>
-          <w:szCs w:val="24"/>
-        </w:rPr>
-      </w:pPr>
-      <w:r>
-        <w:rPr>
-          <w:rFonts w:cstheme="minorHAnsi"/>
-          <w:sz w:val="24"/>
-          <w:szCs w:val="24"/>
-        </w:rPr>
-        <w:t>Template Literals w/ Exclude</w:t>
-      </w:r>
-    </w:p>
-    <w:p>
-      <w:pPr>
-        <w:pStyle w:val="ListParagraph"/>
-        <w:numPr>
-          <w:ilvl w:val="0"/>
-          <w:numId w:val="5"/>
-        </w:numPr>
-        <w:rPr>
-          <w:rFonts w:cstheme="minorHAnsi"/>
-          <w:sz w:val="24"/>
-          <w:szCs w:val="24"/>
-        </w:rPr>
-      </w:pPr>
-      <w:r>
-        <w:rPr>
-          <w:rFonts w:cstheme="minorHAnsi"/>
-          <w:sz w:val="24"/>
-          <w:szCs w:val="24"/>
-        </w:rPr>
-        <w:lastRenderedPageBreak/>
         <w:t>Extracting props</w:t>
       </w:r>
     </w:p>

</xml_diff>